<commit_message>
Final refinements to PMM alignment review
- Renamed coverage label from Opportunity to Not Currently Captured
- Strengthened Kano recommendation with GTM rationale; moved to High Priority
- Moved Roadmap Confidentiality from High to Medium Priority
- Applied consistent implementation-agnostic language throughout table
- Added explanatory sentence to Tier Key on cover page
- Improved table cell spacing and readability

Co-Authored-By: Claude <noreply@anthropic.com>
</commit_message>
<xml_diff>
--- a/Release_Notes_PMM_Alignment.docx
+++ b/Release_Notes_PMM_Alignment.docx
@@ -90,7 +90,7 @@
     </w:p>
     <w:tbl>
       <w:tblPr>
-        <w:tblW w:type="dxa" w:w="13680"/>
+        <w:tblW w:type="dxa" w:w="13968"/>
         <w:tblBorders>
           <w:top w:val="single" w:color="auto" w:sz="4"/>
           <w:left w:val="single" w:color="auto" w:sz="4"/>
@@ -101,14 +101,14 @@
         </w:tblBorders>
       </w:tblPr>
       <w:tblGrid>
-        <w:gridCol w:w="4560"/>
-        <w:gridCol w:w="4560"/>
-        <w:gridCol w:w="4560"/>
+        <w:gridCol w:w="4656"/>
+        <w:gridCol w:w="4656"/>
+        <w:gridCol w:w="4656"/>
       </w:tblGrid>
       <w:tr>
         <w:tc>
           <w:tcPr>
-            <w:tcW w:type="dxa" w:w="4560"/>
+            <w:tcW w:type="dxa" w:w="4656"/>
             <w:tcBorders>
               <w:top w:val="single" w:color="CBD5E0" w:sz="4"/>
               <w:left w:val="single" w:color="CBD5E0" w:sz="4"/>
@@ -119,7 +119,7 @@
           </w:tcPr>
           <w:p>
             <w:pPr>
-              <w:spacing w:after="60" w:before="60"/>
+              <w:spacing w:after="80" w:before="80"/>
               <w:jc w:val="center"/>
             </w:pPr>
             <w:r>
@@ -137,7 +137,7 @@
         </w:tc>
         <w:tc>
           <w:tcPr>
-            <w:tcW w:type="dxa" w:w="4560"/>
+            <w:tcW w:type="dxa" w:w="4656"/>
             <w:tcBorders>
               <w:top w:val="single" w:color="CBD5E0" w:sz="4"/>
               <w:left w:val="single" w:color="CBD5E0" w:sz="4"/>
@@ -148,7 +148,7 @@
           </w:tcPr>
           <w:p>
             <w:pPr>
-              <w:spacing w:after="60" w:before="60"/>
+              <w:spacing w:after="80" w:before="80"/>
               <w:jc w:val="center"/>
             </w:pPr>
             <w:r>
@@ -166,7 +166,7 @@
         </w:tc>
         <w:tc>
           <w:tcPr>
-            <w:tcW w:type="dxa" w:w="4560"/>
+            <w:tcW w:type="dxa" w:w="4656"/>
             <w:tcBorders>
               <w:top w:val="single" w:color="CBD5E0" w:sz="4"/>
               <w:left w:val="single" w:color="CBD5E0" w:sz="4"/>
@@ -177,7 +177,7 @@
           </w:tcPr>
           <w:p>
             <w:pPr>
-              <w:spacing w:after="60" w:before="60"/>
+              <w:spacing w:after="80" w:before="80"/>
               <w:jc w:val="center"/>
             </w:pPr>
             <w:r>
@@ -189,7 +189,7 @@
                 <w:sz w:val="18"/>
                 <w:szCs w:val="18"/>
               </w:rPr>
-              <w:t xml:space="preserve">Opportunity</w:t>
+              <w:t xml:space="preserve">Not Currently Captured</w:t>
             </w:r>
           </w:p>
         </w:tc>
@@ -197,12 +197,12 @@
     </w:tbl>
     <w:p>
       <w:pPr>
-        <w:spacing w:after="60" w:before="120"/>
-      </w:pPr>
-    </w:p>
-    <w:p>
-      <w:pPr>
-        <w:spacing w:after="0"/>
+        <w:spacing w:after="60" w:before="140"/>
+      </w:pPr>
+    </w:p>
+    <w:p>
+      <w:pPr>
+        <w:spacing w:after="40"/>
         <w:jc w:val="center"/>
       </w:pPr>
       <w:r>
@@ -234,7 +234,7 @@
           <w:sz w:val="18"/>
           <w:szCs w:val="18"/>
         </w:rPr>
-        <w:t xml:space="preserve"> = relevant for all launch tiers   </w:t>
+        <w:t xml:space="preserve">  ·  </w:t>
       </w:r>
       <w:r>
         <w:rPr>
@@ -247,14 +247,22 @@
         </w:rPr>
         <w:t xml:space="preserve">Scenario / Higher Tiers</w:t>
       </w:r>
-      <w:r>
-        <w:rPr>
-          <w:rFonts w:ascii="Calibri" w:cs="Calibri" w:eastAsia="Calibri" w:hAnsi="Calibri"/>
+    </w:p>
+    <w:p>
+      <w:pPr>
+        <w:spacing w:after="0"/>
+        <w:jc w:val="center"/>
+      </w:pPr>
+      <w:r>
+        <w:rPr>
+          <w:rFonts w:ascii="Calibri" w:cs="Calibri" w:eastAsia="Calibri" w:hAnsi="Calibri"/>
+          <w:i/>
+          <w:iCs/>
           <w:color w:val="4A5568"/>
-          <w:sz w:val="18"/>
-          <w:szCs w:val="18"/>
-        </w:rPr>
-        <w:t xml:space="preserve"> = most relevant for Tier 1–2 or specific launch scenarios</w:t>
+          <w:sz w:val="17"/>
+          <w:szCs w:val="17"/>
+        </w:rPr>
+        <w:t xml:space="preserve">Core represents information Product Marketing typically requires for most launches. Scenario / Higher Tiers represents information that becomes important for Tier 1, Tier 2, or specific launch scenarios.</w:t>
       </w:r>
     </w:p>
     <w:p>
@@ -336,7 +344,7 @@
           <w:sz w:val="20"/>
           <w:szCs w:val="20"/>
         </w:rPr>
-        <w:t xml:space="preserve">Important: this review is implementation-agnostic. It identifies </w:t>
+        <w:t xml:space="preserve">This review is </w:t>
       </w:r>
       <w:r>
         <w:rPr>
@@ -346,7 +354,7 @@
           <w:sz w:val="20"/>
           <w:szCs w:val="20"/>
         </w:rPr>
-        <w:t xml:space="preserve">where information is not currently captured</w:t>
+        <w:t xml:space="preserve">implementation-agnostic</w:t>
       </w:r>
       <w:r>
         <w:rPr>
@@ -354,38 +362,20 @@
           <w:sz w:val="20"/>
           <w:szCs w:val="20"/>
         </w:rPr>
-        <w:t xml:space="preserve"> — not </w:t>
-      </w:r>
-      <w:r>
-        <w:rPr>
-          <w:rFonts w:ascii="Calibri" w:cs="Calibri" w:eastAsia="Calibri" w:hAnsi="Calibri"/>
-          <w:b/>
-          <w:bCs/>
+        <w:t xml:space="preserve">. It identifies where information is not currently captured by the skill — not where it should be added. Information identified here may ultimately be addressed through the Release Notes Skill, a PRD, a Shift Left document, a launch checklist, or another existing Product workflow. The appropriate source is a decision for the team to make based on existing workflows and authoring experience.</w:t>
+      </w:r>
+    </w:p>
+    <w:p>
+      <w:pPr>
+        <w:spacing w:after="140"/>
+      </w:pPr>
+      <w:r>
+        <w:rPr>
+          <w:rFonts w:ascii="Calibri" w:cs="Calibri" w:eastAsia="Calibri" w:hAnsi="Calibri"/>
           <w:sz w:val="20"/>
           <w:szCs w:val="20"/>
         </w:rPr>
-        <w:t xml:space="preserve">where it should be added</w:t>
-      </w:r>
-      <w:r>
-        <w:rPr>
-          <w:rFonts w:ascii="Calibri" w:cs="Calibri" w:eastAsia="Calibri" w:hAnsi="Calibri"/>
-          <w:sz w:val="20"/>
-          <w:szCs w:val="20"/>
-        </w:rPr>
-        <w:t xml:space="preserve">. Information gaps identified here may ultimately be addressed through the Release Notes Skill, a PRD, a Shift Left document, a launch checklist, or another existing Product workflow. The appropriate source is a decision for the team to make based on existing workflows and authoring experience.</w:t>
-      </w:r>
-    </w:p>
-    <w:p>
-      <w:pPr>
-        <w:spacing w:after="140"/>
-      </w:pPr>
-      <w:r>
-        <w:rPr>
-          <w:rFonts w:ascii="Calibri" w:cs="Calibri" w:eastAsia="Calibri" w:hAnsi="Calibri"/>
-          <w:sz w:val="20"/>
-          <w:szCs w:val="20"/>
-        </w:rPr>
-        <w:t xml:space="preserve">Many of the information requirements identified below do not require additional writing. In several cases, a reference or link to existing documentation — a Confluence page, an existing PRD, or a Loom recording — would be sufficient to close the gap without creating meaningful authoring burden for Product teams.</w:t>
+        <w:t xml:space="preserve">Many of the information requirements identified below do not require additional writing. In a large number of cases, a reference or link to existing documentation — a Confluence page, a PRD, or a Loom recording — would be sufficient to improve downstream collaboration without creating meaningful authoring burden for Product teams.</w:t>
       </w:r>
     </w:p>
     <w:p>
@@ -395,7 +385,7 @@
     </w:p>
     <w:tbl>
       <w:tblPr>
-        <w:tblW w:type="dxa" w:w="13680"/>
+        <w:tblW w:type="dxa" w:w="13968"/>
         <w:tblBorders>
           <w:top w:val="single" w:color="auto" w:sz="4"/>
           <w:left w:val="single" w:color="auto" w:sz="4"/>
@@ -406,15 +396,15 @@
         </w:tblBorders>
       </w:tblPr>
       <w:tblGrid>
-        <w:gridCol w:w="3420"/>
-        <w:gridCol w:w="3420"/>
-        <w:gridCol w:w="3420"/>
-        <w:gridCol w:w="3420"/>
+        <w:gridCol w:w="3492"/>
+        <w:gridCol w:w="3492"/>
+        <w:gridCol w:w="3492"/>
+        <w:gridCol w:w="3492"/>
       </w:tblGrid>
       <w:tr>
         <w:tc>
           <w:tcPr>
-            <w:tcW w:type="dxa" w:w="3420"/>
+            <w:tcW w:type="dxa" w:w="3492"/>
             <w:tcBorders>
               <w:top w:val="single" w:color="CBD5E0" w:sz="4"/>
               <w:left w:val="single" w:color="CBD5E0" w:sz="4"/>
@@ -458,7 +448,7 @@
         </w:tc>
         <w:tc>
           <w:tcPr>
-            <w:tcW w:type="dxa" w:w="3420"/>
+            <w:tcW w:type="dxa" w:w="3492"/>
             <w:tcBorders>
               <w:top w:val="single" w:color="CBD5E0" w:sz="4"/>
               <w:left w:val="single" w:color="CBD5E0" w:sz="4"/>
@@ -504,7 +494,7 @@
         </w:tc>
         <w:tc>
           <w:tcPr>
-            <w:tcW w:type="dxa" w:w="3420"/>
+            <w:tcW w:type="dxa" w:w="3492"/>
             <w:tcBorders>
               <w:top w:val="single" w:color="CBD5E0" w:sz="4"/>
               <w:left w:val="single" w:color="CBD5E0" w:sz="4"/>
@@ -550,7 +540,7 @@
         </w:tc>
         <w:tc>
           <w:tcPr>
-            <w:tcW w:type="dxa" w:w="3420"/>
+            <w:tcW w:type="dxa" w:w="3492"/>
             <w:tcBorders>
               <w:top w:val="single" w:color="CBD5E0" w:sz="4"/>
               <w:left w:val="single" w:color="CBD5E0" w:sz="4"/>
@@ -590,7 +580,7 @@
                 <w:sz w:val="16"/>
                 <w:szCs w:val="16"/>
               </w:rPr>
-              <w:t xml:space="preserve">Opportunities</w:t>
+              <w:t xml:space="preserve">Not Currently Captured</w:t>
             </w:r>
           </w:p>
         </w:tc>
@@ -631,12 +621,12 @@
           <w:sz w:val="20"/>
           <w:szCs w:val="20"/>
         </w:rPr>
-        <w:t xml:space="preserve">Each PMM Information Requirement is mapped below against the current Release Notes Skill. Where information is not currently captured, the table notes what could be considered — through the skill or another Product workflow — and why it supports downstream GTM planning.</w:t>
+        <w:t xml:space="preserve">Each PMM Information Requirement is mapped below against the current Release Notes Skill. Where information is not currently captured by the skill, the table describes what that information is, notes that it may already exist in another Product artifact, and explains why it is useful for downstream GTM planning.</w:t>
       </w:r>
     </w:p>
     <w:tbl>
       <w:tblPr>
-        <w:tblW w:type="dxa" w:w="13680"/>
+        <w:tblW w:type="dxa" w:w="13968"/>
         <w:tblBorders>
           <w:top w:val="single" w:color="auto" w:sz="4"/>
           <w:left w:val="single" w:color="auto" w:sz="4"/>
@@ -648,10 +638,10 @@
       </w:tblPr>
       <w:tblGrid>
         <w:gridCol w:w="1700"/>
-        <w:gridCol w:w="1200"/>
-        <w:gridCol w:w="3160"/>
-        <w:gridCol w:w="3460"/>
-        <w:gridCol w:w="4160"/>
+        <w:gridCol w:w="1268"/>
+        <w:gridCol w:w="3200"/>
+        <w:gridCol w:w="3600"/>
+        <w:gridCol w:w="4200"/>
       </w:tblGrid>
       <w:tr>
         <w:trPr>
@@ -671,7 +661,7 @@
           </w:tcPr>
           <w:p>
             <w:pPr>
-              <w:spacing w:after="80" w:before="80"/>
+              <w:spacing w:after="100" w:before="100"/>
             </w:pPr>
             <w:r>
               <w:rPr>
@@ -688,7 +678,7 @@
         </w:tc>
         <w:tc>
           <w:tcPr>
-            <w:tcW w:type="dxa" w:w="1200"/>
+            <w:tcW w:type="dxa" w:w="1268"/>
             <w:tcBorders>
               <w:top w:val="single" w:color="1F3864" w:sz="4"/>
               <w:left w:val="single" w:color="1F3864" w:sz="4"/>
@@ -700,7 +690,7 @@
           </w:tcPr>
           <w:p>
             <w:pPr>
-              <w:spacing w:after="80" w:before="80"/>
+              <w:spacing w:after="100" w:before="100"/>
             </w:pPr>
             <w:r>
               <w:rPr>
@@ -717,7 +707,7 @@
         </w:tc>
         <w:tc>
           <w:tcPr>
-            <w:tcW w:type="dxa" w:w="3160"/>
+            <w:tcW w:type="dxa" w:w="3200"/>
             <w:tcBorders>
               <w:top w:val="single" w:color="1F3864" w:sz="4"/>
               <w:left w:val="single" w:color="1F3864" w:sz="4"/>
@@ -729,7 +719,7 @@
           </w:tcPr>
           <w:p>
             <w:pPr>
-              <w:spacing w:after="80" w:before="80"/>
+              <w:spacing w:after="100" w:before="100"/>
             </w:pPr>
             <w:r>
               <w:rPr>
@@ -746,7 +736,7 @@
         </w:tc>
         <w:tc>
           <w:tcPr>
-            <w:tcW w:type="dxa" w:w="3460"/>
+            <w:tcW w:type="dxa" w:w="3600"/>
             <w:tcBorders>
               <w:top w:val="single" w:color="1F3864" w:sz="4"/>
               <w:left w:val="single" w:color="1F3864" w:sz="4"/>
@@ -758,7 +748,7 @@
           </w:tcPr>
           <w:p>
             <w:pPr>
-              <w:spacing w:after="80" w:before="80"/>
+              <w:spacing w:after="100" w:before="100"/>
             </w:pPr>
             <w:r>
               <w:rPr>
@@ -769,13 +759,13 @@
                 <w:sz w:val="18"/>
                 <w:szCs w:val="18"/>
               </w:rPr>
-              <w:t xml:space="preserve">What Could Be Considered</w:t>
-            </w:r>
-          </w:p>
-        </w:tc>
-        <w:tc>
-          <w:tcPr>
-            <w:tcW w:type="dxa" w:w="4160"/>
+              <w:t xml:space="preserve">What Is Not Currently Captured</w:t>
+            </w:r>
+          </w:p>
+        </w:tc>
+        <w:tc>
+          <w:tcPr>
+            <w:tcW w:type="dxa" w:w="4200"/>
             <w:tcBorders>
               <w:top w:val="single" w:color="1F3864" w:sz="4"/>
               <w:left w:val="single" w:color="1F3864" w:sz="4"/>
@@ -787,7 +777,7 @@
           </w:tcPr>
           <w:p>
             <w:pPr>
-              <w:spacing w:after="80" w:before="80"/>
+              <w:spacing w:after="100" w:before="100"/>
             </w:pPr>
             <w:r>
               <w:rPr>
@@ -817,7 +807,7 @@
           </w:tcPr>
           <w:p>
             <w:pPr>
-              <w:spacing w:after="60" w:before="60"/>
+              <w:spacing w:after="100" w:before="100"/>
             </w:pPr>
             <w:r>
               <w:rPr>
@@ -848,7 +838,7 @@
           </w:tcPr>
           <w:p>
             <w:pPr>
-              <w:spacing w:after="40" w:before="60"/>
+              <w:spacing w:after="40" w:before="100"/>
             </w:pPr>
             <w:r>
               <w:rPr>
@@ -864,7 +854,7 @@
           </w:p>
           <w:p>
             <w:pPr>
-              <w:spacing w:after="60" w:before="0"/>
+              <w:spacing w:after="100" w:before="0"/>
             </w:pPr>
             <w:r>
               <w:rPr>
@@ -881,7 +871,7 @@
         </w:tc>
         <w:tc>
           <w:tcPr>
-            <w:tcW w:type="dxa" w:w="1200"/>
+            <w:tcW w:type="dxa" w:w="1268"/>
             <w:tcBorders>
               <w:top w:val="single" w:color="CBD5E0" w:sz="4"/>
               <w:left w:val="single" w:color="CBD5E0" w:sz="4"/>
@@ -893,7 +883,7 @@
           </w:tcPr>
           <w:p>
             <w:pPr>
-              <w:spacing w:after="60" w:before="60"/>
+              <w:spacing w:after="100" w:before="100"/>
               <w:jc w:val="center"/>
             </w:pPr>
             <w:r>
@@ -902,8 +892,8 @@
                 <w:b/>
                 <w:bCs/>
                 <w:color w:val="92400E"/>
-                <w:sz w:val="18"/>
-                <w:szCs w:val="18"/>
+                <w:sz w:val="17"/>
+                <w:szCs w:val="17"/>
               </w:rPr>
               <w:t xml:space="preserve">Partially Covered</w:t>
             </w:r>
@@ -911,79 +901,79 @@
         </w:tc>
         <w:tc>
           <w:tcPr>
-            <w:tcW w:type="dxa" w:w="3160"/>
-            <w:tcBorders>
-              <w:top w:val="single" w:color="CBD5E0" w:sz="4"/>
-              <w:left w:val="single" w:color="CBD5E0" w:sz="4"/>
-              <w:bottom w:val="single" w:color="CBD5E0" w:sz="4"/>
-              <w:right w:val="single" w:color="CBD5E0" w:sz="4"/>
-            </w:tcBorders>
-            <w:vAlign w:val="top"/>
-          </w:tcPr>
-          <w:p>
-            <w:pPr>
-              <w:spacing w:after="60" w:before="60"/>
-            </w:pPr>
-            <w:r>
-              <w:rPr>
-                <w:rFonts w:ascii="Calibri" w:cs="Calibri" w:eastAsia="Calibri" w:hAnsi="Calibri"/>
-                <w:color w:val="4A5568"/>
-                <w:sz w:val="18"/>
-                <w:szCs w:val="18"/>
-              </w:rPr>
-              <w:t xml:space="preserve">The problem paragraph captures customer pain in the customer's voice — a deliberate and effective structural choice. The skill prohibits unsubstantiated claims, ensuring specificity.</w:t>
-            </w:r>
-          </w:p>
-        </w:tc>
-        <w:tc>
-          <w:tcPr>
-            <w:tcW w:type="dxa" w:w="3460"/>
-            <w:tcBorders>
-              <w:top w:val="single" w:color="CBD5E0" w:sz="4"/>
-              <w:left w:val="single" w:color="CBD5E0" w:sz="4"/>
-              <w:bottom w:val="single" w:color="CBD5E0" w:sz="4"/>
-              <w:right w:val="single" w:color="CBD5E0" w:sz="4"/>
-            </w:tcBorders>
-            <w:vAlign w:val="top"/>
-          </w:tcPr>
-          <w:p>
-            <w:pPr>
-              <w:spacing w:after="60" w:before="60"/>
-            </w:pPr>
-            <w:r>
-              <w:rPr>
-                <w:rFonts w:ascii="Calibri" w:cs="Calibri" w:eastAsia="Calibri" w:hAnsi="Calibri"/>
-                <w:color w:val="4A5568"/>
-                <w:sz w:val="18"/>
-                <w:szCs w:val="18"/>
-              </w:rPr>
-              <w:t xml:space="preserve">The specific workaround customers use today, the market trigger making the problem relevant now, and the business cost of inaction are not currently captured by the skill. This information may be sourced through the skill or referenced from an existing PRD or Shift Left document.</w:t>
-            </w:r>
-          </w:p>
-        </w:tc>
-        <w:tc>
-          <w:tcPr>
-            <w:tcW w:type="dxa" w:w="4160"/>
-            <w:tcBorders>
-              <w:top w:val="single" w:color="CBD5E0" w:sz="4"/>
-              <w:left w:val="single" w:color="CBD5E0" w:sz="4"/>
-              <w:bottom w:val="single" w:color="CBD5E0" w:sz="4"/>
-              <w:right w:val="single" w:color="CBD5E0" w:sz="4"/>
-            </w:tcBorders>
-            <w:vAlign w:val="top"/>
-          </w:tcPr>
-          <w:p>
-            <w:pPr>
-              <w:spacing w:after="60" w:before="60"/>
-            </w:pPr>
-            <w:r>
-              <w:rPr>
-                <w:rFonts w:ascii="Calibri" w:cs="Calibri" w:eastAsia="Calibri" w:hAnsi="Calibri"/>
-                <w:color w:val="4A5568"/>
-                <w:sz w:val="18"/>
-                <w:szCs w:val="18"/>
-              </w:rPr>
-              <w:t xml:space="preserve">The workaround and market trigger directly feed the launch narrative and campaign messaging. The cost of inaction helps PMM prioritise urgency and supports analyst briefing preparation.</w:t>
+            <w:tcW w:type="dxa" w:w="3200"/>
+            <w:tcBorders>
+              <w:top w:val="single" w:color="CBD5E0" w:sz="4"/>
+              <w:left w:val="single" w:color="CBD5E0" w:sz="4"/>
+              <w:bottom w:val="single" w:color="CBD5E0" w:sz="4"/>
+              <w:right w:val="single" w:color="CBD5E0" w:sz="4"/>
+            </w:tcBorders>
+            <w:vAlign w:val="top"/>
+          </w:tcPr>
+          <w:p>
+            <w:pPr>
+              <w:spacing w:after="100" w:before="100"/>
+            </w:pPr>
+            <w:r>
+              <w:rPr>
+                <w:rFonts w:ascii="Calibri" w:cs="Calibri" w:eastAsia="Calibri" w:hAnsi="Calibri"/>
+                <w:color w:val="4A5568"/>
+                <w:sz w:val="18"/>
+                <w:szCs w:val="18"/>
+              </w:rPr>
+              <w:t xml:space="preserve">The problem paragraph captures customer pain in the customer's voice — a deliberate and effective structural choice. The skill prohibits unsubstantiated claims, reinforcing specificity throughout.</w:t>
+            </w:r>
+          </w:p>
+        </w:tc>
+        <w:tc>
+          <w:tcPr>
+            <w:tcW w:type="dxa" w:w="3600"/>
+            <w:tcBorders>
+              <w:top w:val="single" w:color="CBD5E0" w:sz="4"/>
+              <w:left w:val="single" w:color="CBD5E0" w:sz="4"/>
+              <w:bottom w:val="single" w:color="CBD5E0" w:sz="4"/>
+              <w:right w:val="single" w:color="CBD5E0" w:sz="4"/>
+            </w:tcBorders>
+            <w:vAlign w:val="top"/>
+          </w:tcPr>
+          <w:p>
+            <w:pPr>
+              <w:spacing w:after="100" w:before="100"/>
+            </w:pPr>
+            <w:r>
+              <w:rPr>
+                <w:rFonts w:ascii="Calibri" w:cs="Calibri" w:eastAsia="Calibri" w:hAnsi="Calibri"/>
+                <w:color w:val="4A5568"/>
+                <w:sz w:val="18"/>
+                <w:szCs w:val="18"/>
+              </w:rPr>
+              <w:t xml:space="preserve">The specific workaround customers use today, the market trigger making the problem relevant now, and the business cost of inaction are not currently captured by the skill and may already exist in another Product artifact such as a PRD or Shift Left document.</w:t>
+            </w:r>
+          </w:p>
+        </w:tc>
+        <w:tc>
+          <w:tcPr>
+            <w:tcW w:type="dxa" w:w="4200"/>
+            <w:tcBorders>
+              <w:top w:val="single" w:color="CBD5E0" w:sz="4"/>
+              <w:left w:val="single" w:color="CBD5E0" w:sz="4"/>
+              <w:bottom w:val="single" w:color="CBD5E0" w:sz="4"/>
+              <w:right w:val="single" w:color="CBD5E0" w:sz="4"/>
+            </w:tcBorders>
+            <w:vAlign w:val="top"/>
+          </w:tcPr>
+          <w:p>
+            <w:pPr>
+              <w:spacing w:after="100" w:before="100"/>
+            </w:pPr>
+            <w:r>
+              <w:rPr>
+                <w:rFonts w:ascii="Calibri" w:cs="Calibri" w:eastAsia="Calibri" w:hAnsi="Calibri"/>
+                <w:color w:val="4A5568"/>
+                <w:sz w:val="18"/>
+                <w:szCs w:val="18"/>
+              </w:rPr>
+              <w:t xml:space="preserve">The workaround and market trigger directly feed the launch narrative and campaign messaging. The cost of inaction helps PMM prioritise urgency in communications and supports analyst briefing preparation.</w:t>
             </w:r>
           </w:p>
         </w:tc>
@@ -1003,7 +993,7 @@
           </w:tcPr>
           <w:p>
             <w:pPr>
-              <w:spacing w:after="40" w:before="60"/>
+              <w:spacing w:after="40" w:before="100"/>
             </w:pPr>
             <w:r>
               <w:rPr>
@@ -1019,7 +1009,7 @@
           </w:p>
           <w:p>
             <w:pPr>
-              <w:spacing w:after="60" w:before="0"/>
+              <w:spacing w:after="100" w:before="0"/>
             </w:pPr>
             <w:r>
               <w:rPr>
@@ -1036,7 +1026,7 @@
         </w:tc>
         <w:tc>
           <w:tcPr>
-            <w:tcW w:type="dxa" w:w="1200"/>
+            <w:tcW w:type="dxa" w:w="1268"/>
             <w:tcBorders>
               <w:top w:val="single" w:color="CBD5E0" w:sz="4"/>
               <w:left w:val="single" w:color="CBD5E0" w:sz="4"/>
@@ -1048,7 +1038,7 @@
           </w:tcPr>
           <w:p>
             <w:pPr>
-              <w:spacing w:after="60" w:before="60"/>
+              <w:spacing w:after="100" w:before="100"/>
               <w:jc w:val="center"/>
             </w:pPr>
             <w:r>
@@ -1057,8 +1047,8 @@
                 <w:b/>
                 <w:bCs/>
                 <w:color w:val="92400E"/>
-                <w:sz w:val="18"/>
-                <w:szCs w:val="18"/>
+                <w:sz w:val="17"/>
+                <w:szCs w:val="17"/>
               </w:rPr>
               <w:t xml:space="preserve">Partially Covered</w:t>
             </w:r>
@@ -1066,18 +1056,18 @@
         </w:tc>
         <w:tc>
           <w:tcPr>
-            <w:tcW w:type="dxa" w:w="3160"/>
-            <w:tcBorders>
-              <w:top w:val="single" w:color="CBD5E0" w:sz="4"/>
-              <w:left w:val="single" w:color="CBD5E0" w:sz="4"/>
-              <w:bottom w:val="single" w:color="CBD5E0" w:sz="4"/>
-              <w:right w:val="single" w:color="CBD5E0" w:sz="4"/>
-            </w:tcBorders>
-            <w:vAlign w:val="top"/>
-          </w:tcPr>
-          <w:p>
-            <w:pPr>
-              <w:spacing w:after="60" w:before="60"/>
+            <w:tcW w:type="dxa" w:w="3200"/>
+            <w:tcBorders>
+              <w:top w:val="single" w:color="CBD5E0" w:sz="4"/>
+              <w:left w:val="single" w:color="CBD5E0" w:sz="4"/>
+              <w:bottom w:val="single" w:color="CBD5E0" w:sz="4"/>
+              <w:right w:val="single" w:color="CBD5E0" w:sz="4"/>
+            </w:tcBorders>
+            <w:vAlign w:val="top"/>
+          </w:tcPr>
+          <w:p>
+            <w:pPr>
+              <w:spacing w:after="100" w:before="100"/>
             </w:pPr>
             <w:r>
               <w:rPr>
@@ -1092,53 +1082,53 @@
         </w:tc>
         <w:tc>
           <w:tcPr>
-            <w:tcW w:type="dxa" w:w="3460"/>
-            <w:tcBorders>
-              <w:top w:val="single" w:color="CBD5E0" w:sz="4"/>
-              <w:left w:val="single" w:color="CBD5E0" w:sz="4"/>
-              <w:bottom w:val="single" w:color="CBD5E0" w:sz="4"/>
-              <w:right w:val="single" w:color="CBD5E0" w:sz="4"/>
-            </w:tcBorders>
-            <w:vAlign w:val="top"/>
-          </w:tcPr>
-          <w:p>
-            <w:pPr>
-              <w:spacing w:after="60" w:before="60"/>
-            </w:pPr>
-            <w:r>
-              <w:rPr>
-                <w:rFonts w:ascii="Calibri" w:cs="Calibri" w:eastAsia="Calibri" w:hAnsi="Calibri"/>
-                <w:color w:val="4A5568"/>
-                <w:sz w:val="18"/>
-                <w:szCs w:val="18"/>
-              </w:rPr>
-              <w:t xml:space="preserve">A Kano model classification (Must-have, Performance, Delighter) with brief rationale, the specific business outcome targeted, and the strategic pillar the feature supports are not currently captured. These may be sourced from the skill or from a PRD or Shift Left document.</w:t>
-            </w:r>
-          </w:p>
-        </w:tc>
-        <w:tc>
-          <w:tcPr>
-            <w:tcW w:type="dxa" w:w="4160"/>
-            <w:tcBorders>
-              <w:top w:val="single" w:color="CBD5E0" w:sz="4"/>
-              <w:left w:val="single" w:color="CBD5E0" w:sz="4"/>
-              <w:bottom w:val="single" w:color="CBD5E0" w:sz="4"/>
-              <w:right w:val="single" w:color="CBD5E0" w:sz="4"/>
-            </w:tcBorders>
-            <w:vAlign w:val="top"/>
-          </w:tcPr>
-          <w:p>
-            <w:pPr>
-              <w:spacing w:after="60" w:before="60"/>
-            </w:pPr>
-            <w:r>
-              <w:rPr>
-                <w:rFonts w:ascii="Calibri" w:cs="Calibri" w:eastAsia="Calibri" w:hAnsi="Calibri"/>
-                <w:color w:val="4A5568"/>
-                <w:sz w:val="18"/>
-                <w:szCs w:val="18"/>
-              </w:rPr>
-              <w:t xml:space="preserve">The Kano framing informs how urgently and prominently the feature is positioned. The strategic pillar connection is needed for executive communications, analyst briefings, and QBR slide content.</w:t>
+            <w:tcW w:type="dxa" w:w="3600"/>
+            <w:tcBorders>
+              <w:top w:val="single" w:color="CBD5E0" w:sz="4"/>
+              <w:left w:val="single" w:color="CBD5E0" w:sz="4"/>
+              <w:bottom w:val="single" w:color="CBD5E0" w:sz="4"/>
+              <w:right w:val="single" w:color="CBD5E0" w:sz="4"/>
+            </w:tcBorders>
+            <w:vAlign w:val="top"/>
+          </w:tcPr>
+          <w:p>
+            <w:pPr>
+              <w:spacing w:after="100" w:before="100"/>
+            </w:pPr>
+            <w:r>
+              <w:rPr>
+                <w:rFonts w:ascii="Calibri" w:cs="Calibri" w:eastAsia="Calibri" w:hAnsi="Calibri"/>
+                <w:color w:val="4A5568"/>
+                <w:sz w:val="18"/>
+                <w:szCs w:val="18"/>
+              </w:rPr>
+              <w:t xml:space="preserve">A Kano model classification (Must-have, Performance, Delighter) with brief rationale, the specific business outcome targeted, and the strategic pillar the feature supports are not currently captured by the skill and may already exist in another Product artifact.</w:t>
+            </w:r>
+          </w:p>
+        </w:tc>
+        <w:tc>
+          <w:tcPr>
+            <w:tcW w:type="dxa" w:w="4200"/>
+            <w:tcBorders>
+              <w:top w:val="single" w:color="CBD5E0" w:sz="4"/>
+              <w:left w:val="single" w:color="CBD5E0" w:sz="4"/>
+              <w:bottom w:val="single" w:color="CBD5E0" w:sz="4"/>
+              <w:right w:val="single" w:color="CBD5E0" w:sz="4"/>
+            </w:tcBorders>
+            <w:vAlign w:val="top"/>
+          </w:tcPr>
+          <w:p>
+            <w:pPr>
+              <w:spacing w:after="100" w:before="100"/>
+            </w:pPr>
+            <w:r>
+              <w:rPr>
+                <w:rFonts w:ascii="Calibri" w:cs="Calibri" w:eastAsia="Calibri" w:hAnsi="Calibri"/>
+                <w:color w:val="4A5568"/>
+                <w:sz w:val="18"/>
+                <w:szCs w:val="18"/>
+              </w:rPr>
+              <w:t xml:space="preserve">The Kano framing directly determines launch priority, messaging emphasis, and campaign investment. The strategic pillar connection is needed for executive communications, analyst briefings, and QBR slide content.</w:t>
             </w:r>
           </w:p>
         </w:tc>
@@ -1158,7 +1148,7 @@
           </w:tcPr>
           <w:p>
             <w:pPr>
-              <w:spacing w:after="40" w:before="60"/>
+              <w:spacing w:after="40" w:before="100"/>
             </w:pPr>
             <w:r>
               <w:rPr>
@@ -1174,7 +1164,7 @@
           </w:p>
           <w:p>
             <w:pPr>
-              <w:spacing w:after="60" w:before="0"/>
+              <w:spacing w:after="100" w:before="0"/>
             </w:pPr>
             <w:r>
               <w:rPr>
@@ -1191,7 +1181,7 @@
         </w:tc>
         <w:tc>
           <w:tcPr>
-            <w:tcW w:type="dxa" w:w="1200"/>
+            <w:tcW w:type="dxa" w:w="1268"/>
             <w:tcBorders>
               <w:top w:val="single" w:color="CBD5E0" w:sz="4"/>
               <w:left w:val="single" w:color="CBD5E0" w:sz="4"/>
@@ -1203,7 +1193,7 @@
           </w:tcPr>
           <w:p>
             <w:pPr>
-              <w:spacing w:after="60" w:before="60"/>
+              <w:spacing w:after="100" w:before="100"/>
               <w:jc w:val="center"/>
             </w:pPr>
             <w:r>
@@ -1212,8 +1202,8 @@
                 <w:b/>
                 <w:bCs/>
                 <w:color w:val="92400E"/>
-                <w:sz w:val="18"/>
-                <w:szCs w:val="18"/>
+                <w:sz w:val="17"/>
+                <w:szCs w:val="17"/>
               </w:rPr>
               <w:t xml:space="preserve">Partially Covered</w:t>
             </w:r>
@@ -1221,18 +1211,18 @@
         </w:tc>
         <w:tc>
           <w:tcPr>
-            <w:tcW w:type="dxa" w:w="3160"/>
-            <w:tcBorders>
-              <w:top w:val="single" w:color="CBD5E0" w:sz="4"/>
-              <w:left w:val="single" w:color="CBD5E0" w:sz="4"/>
-              <w:bottom w:val="single" w:color="CBD5E0" w:sz="4"/>
-              <w:right w:val="single" w:color="CBD5E0" w:sz="4"/>
-            </w:tcBorders>
-            <w:vAlign w:val="top"/>
-          </w:tcPr>
-          <w:p>
-            <w:pPr>
-              <w:spacing w:after="60" w:before="60"/>
+            <w:tcW w:type="dxa" w:w="3200"/>
+            <w:tcBorders>
+              <w:top w:val="single" w:color="CBD5E0" w:sz="4"/>
+              <w:left w:val="single" w:color="CBD5E0" w:sz="4"/>
+              <w:bottom w:val="single" w:color="CBD5E0" w:sz="4"/>
+              <w:right w:val="single" w:color="CBD5E0" w:sz="4"/>
+            </w:tcBorders>
+            <w:vAlign w:val="top"/>
+          </w:tcPr>
+          <w:p>
+            <w:pPr>
+              <w:spacing w:after="100" w:before="100"/>
             </w:pPr>
             <w:r>
               <w:rPr>
@@ -1247,44 +1237,44 @@
         </w:tc>
         <w:tc>
           <w:tcPr>
-            <w:tcW w:type="dxa" w:w="3460"/>
-            <w:tcBorders>
-              <w:top w:val="single" w:color="CBD5E0" w:sz="4"/>
-              <w:left w:val="single" w:color="CBD5E0" w:sz="4"/>
-              <w:bottom w:val="single" w:color="CBD5E0" w:sz="4"/>
-              <w:right w:val="single" w:color="CBD5E0" w:sz="4"/>
-            </w:tcBorders>
-            <w:vAlign w:val="top"/>
-          </w:tcPr>
-          <w:p>
-            <w:pPr>
-              <w:spacing w:after="60" w:before="60"/>
-            </w:pPr>
-            <w:r>
-              <w:rPr>
-                <w:rFonts w:ascii="Calibri" w:cs="Calibri" w:eastAsia="Calibri" w:hAnsi="Calibri"/>
-                <w:color w:val="4A5568"/>
-                <w:sz w:val="18"/>
-                <w:szCs w:val="18"/>
-              </w:rPr>
-              <w:t xml:space="preserve">30/60/90-day post-launch metrics with the specific dashboard or report where they live are not currently captured. These could be referenced from an existing tracker or linked from the skill output rather than authored from scratch.</w:t>
-            </w:r>
-          </w:p>
-        </w:tc>
-        <w:tc>
-          <w:tcPr>
-            <w:tcW w:type="dxa" w:w="4160"/>
-            <w:tcBorders>
-              <w:top w:val="single" w:color="CBD5E0" w:sz="4"/>
-              <w:left w:val="single" w:color="CBD5E0" w:sz="4"/>
-              <w:bottom w:val="single" w:color="CBD5E0" w:sz="4"/>
-              <w:right w:val="single" w:color="CBD5E0" w:sz="4"/>
-            </w:tcBorders>
-            <w:vAlign w:val="top"/>
-          </w:tcPr>
-          <w:p>
-            <w:pPr>
-              <w:spacing w:after="60" w:before="60"/>
+            <w:tcW w:type="dxa" w:w="3600"/>
+            <w:tcBorders>
+              <w:top w:val="single" w:color="CBD5E0" w:sz="4"/>
+              <w:left w:val="single" w:color="CBD5E0" w:sz="4"/>
+              <w:bottom w:val="single" w:color="CBD5E0" w:sz="4"/>
+              <w:right w:val="single" w:color="CBD5E0" w:sz="4"/>
+            </w:tcBorders>
+            <w:vAlign w:val="top"/>
+          </w:tcPr>
+          <w:p>
+            <w:pPr>
+              <w:spacing w:after="100" w:before="100"/>
+            </w:pPr>
+            <w:r>
+              <w:rPr>
+                <w:rFonts w:ascii="Calibri" w:cs="Calibri" w:eastAsia="Calibri" w:hAnsi="Calibri"/>
+                <w:color w:val="4A5568"/>
+                <w:sz w:val="18"/>
+                <w:szCs w:val="18"/>
+              </w:rPr>
+              <w:t xml:space="preserve">30/60/90-day post-launch metrics with the specific dashboard or report where they live are not currently captured by the skill and may already exist in a product tracker or reporting document.</w:t>
+            </w:r>
+          </w:p>
+        </w:tc>
+        <w:tc>
+          <w:tcPr>
+            <w:tcW w:type="dxa" w:w="4200"/>
+            <w:tcBorders>
+              <w:top w:val="single" w:color="CBD5E0" w:sz="4"/>
+              <w:left w:val="single" w:color="CBD5E0" w:sz="4"/>
+              <w:bottom w:val="single" w:color="CBD5E0" w:sz="4"/>
+              <w:right w:val="single" w:color="CBD5E0" w:sz="4"/>
+            </w:tcBorders>
+            <w:vAlign w:val="top"/>
+          </w:tcPr>
+          <w:p>
+            <w:pPr>
+              <w:spacing w:after="100" w:before="100"/>
             </w:pPr>
             <w:r>
               <w:rPr>
@@ -1312,7 +1302,7 @@
           </w:tcPr>
           <w:p>
             <w:pPr>
-              <w:spacing w:after="60" w:before="60"/>
+              <w:spacing w:after="100" w:before="100"/>
             </w:pPr>
             <w:r>
               <w:rPr>
@@ -1343,7 +1333,7 @@
           </w:tcPr>
           <w:p>
             <w:pPr>
-              <w:spacing w:after="40" w:before="60"/>
+              <w:spacing w:after="40" w:before="100"/>
             </w:pPr>
             <w:r>
               <w:rPr>
@@ -1359,7 +1349,7 @@
           </w:p>
           <w:p>
             <w:pPr>
-              <w:spacing w:after="60" w:before="0"/>
+              <w:spacing w:after="100" w:before="0"/>
             </w:pPr>
             <w:r>
               <w:rPr>
@@ -1376,7 +1366,7 @@
         </w:tc>
         <w:tc>
           <w:tcPr>
-            <w:tcW w:type="dxa" w:w="1200"/>
+            <w:tcW w:type="dxa" w:w="1268"/>
             <w:tcBorders>
               <w:top w:val="single" w:color="CBD5E0" w:sz="4"/>
               <w:left w:val="single" w:color="CBD5E0" w:sz="4"/>
@@ -1388,7 +1378,7 @@
           </w:tcPr>
           <w:p>
             <w:pPr>
-              <w:spacing w:after="60" w:before="60"/>
+              <w:spacing w:after="100" w:before="100"/>
               <w:jc w:val="center"/>
             </w:pPr>
             <w:r>
@@ -1397,8 +1387,8 @@
                 <w:b/>
                 <w:bCs/>
                 <w:color w:val="92400E"/>
-                <w:sz w:val="18"/>
-                <w:szCs w:val="18"/>
+                <w:sz w:val="17"/>
+                <w:szCs w:val="17"/>
               </w:rPr>
               <w:t xml:space="preserve">Partially Covered</w:t>
             </w:r>
@@ -1406,18 +1396,18 @@
         </w:tc>
         <w:tc>
           <w:tcPr>
-            <w:tcW w:type="dxa" w:w="3160"/>
-            <w:tcBorders>
-              <w:top w:val="single" w:color="CBD5E0" w:sz="4"/>
-              <w:left w:val="single" w:color="CBD5E0" w:sz="4"/>
-              <w:bottom w:val="single" w:color="CBD5E0" w:sz="4"/>
-              <w:right w:val="single" w:color="CBD5E0" w:sz="4"/>
-            </w:tcBorders>
-            <w:vAlign w:val="top"/>
-          </w:tcPr>
-          <w:p>
-            <w:pPr>
-              <w:spacing w:after="60" w:before="60"/>
+            <w:tcW w:type="dxa" w:w="3200"/>
+            <w:tcBorders>
+              <w:top w:val="single" w:color="CBD5E0" w:sz="4"/>
+              <w:left w:val="single" w:color="CBD5E0" w:sz="4"/>
+              <w:bottom w:val="single" w:color="CBD5E0" w:sz="4"/>
+              <w:right w:val="single" w:color="CBD5E0" w:sz="4"/>
+            </w:tcBorders>
+            <w:vAlign w:val="top"/>
+          </w:tcPr>
+          <w:p>
+            <w:pPr>
+              <w:spacing w:after="100" w:before="100"/>
             </w:pPr>
             <w:r>
               <w:rPr>
@@ -1432,53 +1422,53 @@
         </w:tc>
         <w:tc>
           <w:tcPr>
-            <w:tcW w:type="dxa" w:w="3460"/>
-            <w:tcBorders>
-              <w:top w:val="single" w:color="CBD5E0" w:sz="4"/>
-              <w:left w:val="single" w:color="CBD5E0" w:sz="4"/>
-              <w:bottom w:val="single" w:color="CBD5E0" w:sz="4"/>
-              <w:right w:val="single" w:color="CBD5E0" w:sz="4"/>
-            </w:tcBorders>
-            <w:vAlign w:val="top"/>
-          </w:tcPr>
-          <w:p>
-            <w:pPr>
-              <w:spacing w:after="60" w:before="60"/>
-            </w:pPr>
-            <w:r>
-              <w:rPr>
-                <w:rFonts w:ascii="Calibri" w:cs="Calibri" w:eastAsia="Calibri" w:hAnsi="Calibri"/>
-                <w:color w:val="4A5568"/>
-                <w:sz w:val="18"/>
-                <w:szCs w:val="18"/>
-              </w:rPr>
-              <w:t xml:space="preserve">Company size, target verticals, required technology stack, strong-fit signals, anti-patterns, and geographic or regulatory restrictions are not currently captured. This information may be referenced from an existing Shift Left document or ICP resource.</w:t>
-            </w:r>
-          </w:p>
-        </w:tc>
-        <w:tc>
-          <w:tcPr>
-            <w:tcW w:type="dxa" w:w="4160"/>
-            <w:tcBorders>
-              <w:top w:val="single" w:color="CBD5E0" w:sz="4"/>
-              <w:left w:val="single" w:color="CBD5E0" w:sz="4"/>
-              <w:bottom w:val="single" w:color="CBD5E0" w:sz="4"/>
-              <w:right w:val="single" w:color="CBD5E0" w:sz="4"/>
-            </w:tcBorders>
-            <w:vAlign w:val="top"/>
-          </w:tcPr>
-          <w:p>
-            <w:pPr>
-              <w:spacing w:after="60" w:before="60"/>
-            </w:pPr>
-            <w:r>
-              <w:rPr>
-                <w:rFonts w:ascii="Calibri" w:cs="Calibri" w:eastAsia="Calibri" w:hAnsi="Calibri"/>
-                <w:color w:val="4A5568"/>
-                <w:sz w:val="18"/>
-                <w:szCs w:val="18"/>
-              </w:rPr>
-              <w:t xml:space="preserve">Fit signals and anti-patterns define ABM lists, territory scope, and sales qualification criteria. Anti-patterns in particular help Sales disqualify poor-fit opportunities without escalating to Product.</w:t>
+            <w:tcW w:type="dxa" w:w="3600"/>
+            <w:tcBorders>
+              <w:top w:val="single" w:color="CBD5E0" w:sz="4"/>
+              <w:left w:val="single" w:color="CBD5E0" w:sz="4"/>
+              <w:bottom w:val="single" w:color="CBD5E0" w:sz="4"/>
+              <w:right w:val="single" w:color="CBD5E0" w:sz="4"/>
+            </w:tcBorders>
+            <w:vAlign w:val="top"/>
+          </w:tcPr>
+          <w:p>
+            <w:pPr>
+              <w:spacing w:after="100" w:before="100"/>
+            </w:pPr>
+            <w:r>
+              <w:rPr>
+                <w:rFonts w:ascii="Calibri" w:cs="Calibri" w:eastAsia="Calibri" w:hAnsi="Calibri"/>
+                <w:color w:val="4A5568"/>
+                <w:sz w:val="18"/>
+                <w:szCs w:val="18"/>
+              </w:rPr>
+              <w:t xml:space="preserve">Company size, target verticals, required technology stack, strong-fit signals, anti-patterns, and geographic or regulatory restrictions are not currently captured by the skill and may already exist in another Product artifact such as a Shift Left document or ICP resource.</w:t>
+            </w:r>
+          </w:p>
+        </w:tc>
+        <w:tc>
+          <w:tcPr>
+            <w:tcW w:type="dxa" w:w="4200"/>
+            <w:tcBorders>
+              <w:top w:val="single" w:color="CBD5E0" w:sz="4"/>
+              <w:left w:val="single" w:color="CBD5E0" w:sz="4"/>
+              <w:bottom w:val="single" w:color="CBD5E0" w:sz="4"/>
+              <w:right w:val="single" w:color="CBD5E0" w:sz="4"/>
+            </w:tcBorders>
+            <w:vAlign w:val="top"/>
+          </w:tcPr>
+          <w:p>
+            <w:pPr>
+              <w:spacing w:after="100" w:before="100"/>
+            </w:pPr>
+            <w:r>
+              <w:rPr>
+                <w:rFonts w:ascii="Calibri" w:cs="Calibri" w:eastAsia="Calibri" w:hAnsi="Calibri"/>
+                <w:color w:val="4A5568"/>
+                <w:sz w:val="18"/>
+                <w:szCs w:val="18"/>
+              </w:rPr>
+              <w:t xml:space="preserve">Fit signals and anti-patterns define ABM lists, territory scope, and sales qualification criteria. Anti-patterns help Sales disqualify poor-fit opportunities without escalating to Product.</w:t>
             </w:r>
           </w:p>
         </w:tc>
@@ -1498,7 +1488,7 @@
           </w:tcPr>
           <w:p>
             <w:pPr>
-              <w:spacing w:after="40" w:before="60"/>
+              <w:spacing w:after="40" w:before="100"/>
             </w:pPr>
             <w:r>
               <w:rPr>
@@ -1514,7 +1504,7 @@
           </w:p>
           <w:p>
             <w:pPr>
-              <w:spacing w:after="60" w:before="0"/>
+              <w:spacing w:after="100" w:before="0"/>
             </w:pPr>
             <w:r>
               <w:rPr>
@@ -1531,7 +1521,7 @@
         </w:tc>
         <w:tc>
           <w:tcPr>
-            <w:tcW w:type="dxa" w:w="1200"/>
+            <w:tcW w:type="dxa" w:w="1268"/>
             <w:tcBorders>
               <w:top w:val="single" w:color="CBD5E0" w:sz="4"/>
               <w:left w:val="single" w:color="CBD5E0" w:sz="4"/>
@@ -1543,7 +1533,7 @@
           </w:tcPr>
           <w:p>
             <w:pPr>
-              <w:spacing w:after="60" w:before="60"/>
+              <w:spacing w:after="100" w:before="100"/>
               <w:jc w:val="center"/>
             </w:pPr>
             <w:r>
@@ -1552,8 +1542,8 @@
                 <w:b/>
                 <w:bCs/>
                 <w:color w:val="92400E"/>
-                <w:sz w:val="18"/>
-                <w:szCs w:val="18"/>
+                <w:sz w:val="17"/>
+                <w:szCs w:val="17"/>
               </w:rPr>
               <w:t xml:space="preserve">Partially Covered</w:t>
             </w:r>
@@ -1561,18 +1551,18 @@
         </w:tc>
         <w:tc>
           <w:tcPr>
-            <w:tcW w:type="dxa" w:w="3160"/>
-            <w:tcBorders>
-              <w:top w:val="single" w:color="CBD5E0" w:sz="4"/>
-              <w:left w:val="single" w:color="CBD5E0" w:sz="4"/>
-              <w:bottom w:val="single" w:color="CBD5E0" w:sz="4"/>
-              <w:right w:val="single" w:color="CBD5E0" w:sz="4"/>
-            </w:tcBorders>
-            <w:vAlign w:val="top"/>
-          </w:tcPr>
-          <w:p>
-            <w:pPr>
-              <w:spacing w:after="60" w:before="60"/>
+            <w:tcW w:type="dxa" w:w="3200"/>
+            <w:tcBorders>
+              <w:top w:val="single" w:color="CBD5E0" w:sz="4"/>
+              <w:left w:val="single" w:color="CBD5E0" w:sz="4"/>
+              <w:bottom w:val="single" w:color="CBD5E0" w:sz="4"/>
+              <w:right w:val="single" w:color="CBD5E0" w:sz="4"/>
+            </w:tcBorders>
+            <w:vAlign w:val="top"/>
+          </w:tcPr>
+          <w:p>
+            <w:pPr>
+              <w:spacing w:after="100" w:before="100"/>
             </w:pPr>
             <w:r>
               <w:rPr>
@@ -1587,53 +1577,53 @@
         </w:tc>
         <w:tc>
           <w:tcPr>
-            <w:tcW w:type="dxa" w:w="3460"/>
-            <w:tcBorders>
-              <w:top w:val="single" w:color="CBD5E0" w:sz="4"/>
-              <w:left w:val="single" w:color="CBD5E0" w:sz="4"/>
-              <w:bottom w:val="single" w:color="CBD5E0" w:sz="4"/>
-              <w:right w:val="single" w:color="CBD5E0" w:sz="4"/>
-            </w:tcBorders>
-            <w:vAlign w:val="top"/>
-          </w:tcPr>
-          <w:p>
-            <w:pPr>
-              <w:spacing w:after="60" w:before="60"/>
-            </w:pPr>
-            <w:r>
-              <w:rPr>
-                <w:rFonts w:ascii="Calibri" w:cs="Calibri" w:eastAsia="Calibri" w:hAnsi="Calibri"/>
-                <w:color w:val="4A5568"/>
-                <w:sz w:val="18"/>
-                <w:szCs w:val="18"/>
-              </w:rPr>
-              <w:t xml:space="preserve">The primary user's job title, department, and specific task; secondary stakeholders who approve or benefit; and non-target users are not currently captured. A brief reference to an existing persona card or Shift Left document could address this without additional writing.</w:t>
-            </w:r>
-          </w:p>
-        </w:tc>
-        <w:tc>
-          <w:tcPr>
-            <w:tcW w:type="dxa" w:w="4160"/>
-            <w:tcBorders>
-              <w:top w:val="single" w:color="CBD5E0" w:sz="4"/>
-              <w:left w:val="single" w:color="CBD5E0" w:sz="4"/>
-              <w:bottom w:val="single" w:color="CBD5E0" w:sz="4"/>
-              <w:right w:val="single" w:color="CBD5E0" w:sz="4"/>
-            </w:tcBorders>
-            <w:vAlign w:val="top"/>
-          </w:tcPr>
-          <w:p>
-            <w:pPr>
-              <w:spacing w:after="60" w:before="60"/>
-            </w:pPr>
-            <w:r>
-              <w:rPr>
-                <w:rFonts w:ascii="Calibri" w:cs="Calibri" w:eastAsia="Calibri" w:hAnsi="Calibri"/>
-                <w:color w:val="4A5568"/>
-                <w:sz w:val="18"/>
-                <w:szCs w:val="18"/>
-              </w:rPr>
-              <w:t xml:space="preserve">Persona-based messaging, campaign targeting, and multi-threaded account communications require this level of specificity. Secondary stakeholder profiles are particularly useful for enterprise and CS communications.</w:t>
+            <w:tcW w:type="dxa" w:w="3600"/>
+            <w:tcBorders>
+              <w:top w:val="single" w:color="CBD5E0" w:sz="4"/>
+              <w:left w:val="single" w:color="CBD5E0" w:sz="4"/>
+              <w:bottom w:val="single" w:color="CBD5E0" w:sz="4"/>
+              <w:right w:val="single" w:color="CBD5E0" w:sz="4"/>
+            </w:tcBorders>
+            <w:vAlign w:val="top"/>
+          </w:tcPr>
+          <w:p>
+            <w:pPr>
+              <w:spacing w:after="100" w:before="100"/>
+            </w:pPr>
+            <w:r>
+              <w:rPr>
+                <w:rFonts w:ascii="Calibri" w:cs="Calibri" w:eastAsia="Calibri" w:hAnsi="Calibri"/>
+                <w:color w:val="4A5568"/>
+                <w:sz w:val="18"/>
+                <w:szCs w:val="18"/>
+              </w:rPr>
+              <w:t xml:space="preserve">The primary user's job title, department, and specific task; secondary stakeholders who approve or benefit; and non-target users are not currently captured by the skill and may already exist in a persona card or Shift Left document.</w:t>
+            </w:r>
+          </w:p>
+        </w:tc>
+        <w:tc>
+          <w:tcPr>
+            <w:tcW w:type="dxa" w:w="4200"/>
+            <w:tcBorders>
+              <w:top w:val="single" w:color="CBD5E0" w:sz="4"/>
+              <w:left w:val="single" w:color="CBD5E0" w:sz="4"/>
+              <w:bottom w:val="single" w:color="CBD5E0" w:sz="4"/>
+              <w:right w:val="single" w:color="CBD5E0" w:sz="4"/>
+            </w:tcBorders>
+            <w:vAlign w:val="top"/>
+          </w:tcPr>
+          <w:p>
+            <w:pPr>
+              <w:spacing w:after="100" w:before="100"/>
+            </w:pPr>
+            <w:r>
+              <w:rPr>
+                <w:rFonts w:ascii="Calibri" w:cs="Calibri" w:eastAsia="Calibri" w:hAnsi="Calibri"/>
+                <w:color w:val="4A5568"/>
+                <w:sz w:val="18"/>
+                <w:szCs w:val="18"/>
+              </w:rPr>
+              <w:t xml:space="preserve">Persona-based messaging, campaign targeting, and multi-threaded account communications all require this level of specificity. Secondary stakeholder profiles are particularly useful for enterprise and CS communications.</w:t>
             </w:r>
           </w:p>
         </w:tc>
@@ -1653,7 +1643,7 @@
           </w:tcPr>
           <w:p>
             <w:pPr>
-              <w:spacing w:after="40" w:before="60"/>
+              <w:spacing w:after="40" w:before="100"/>
             </w:pPr>
             <w:r>
               <w:rPr>
@@ -1669,7 +1659,7 @@
           </w:p>
           <w:p>
             <w:pPr>
-              <w:spacing w:after="60" w:before="0"/>
+              <w:spacing w:after="100" w:before="0"/>
             </w:pPr>
             <w:r>
               <w:rPr>
@@ -1686,7 +1676,7 @@
         </w:tc>
         <w:tc>
           <w:tcPr>
-            <w:tcW w:type="dxa" w:w="1200"/>
+            <w:tcW w:type="dxa" w:w="1268"/>
             <w:tcBorders>
               <w:top w:val="single" w:color="CBD5E0" w:sz="4"/>
               <w:left w:val="single" w:color="CBD5E0" w:sz="4"/>
@@ -1698,7 +1688,7 @@
           </w:tcPr>
           <w:p>
             <w:pPr>
-              <w:spacing w:after="60" w:before="60"/>
+              <w:spacing w:after="100" w:before="100"/>
               <w:jc w:val="center"/>
             </w:pPr>
             <w:r>
@@ -1707,27 +1697,27 @@
                 <w:b/>
                 <w:bCs/>
                 <w:color w:val="1E40AF"/>
-                <w:sz w:val="18"/>
-                <w:szCs w:val="18"/>
-              </w:rPr>
-              <w:t xml:space="preserve">Opportunity</w:t>
-            </w:r>
-          </w:p>
-        </w:tc>
-        <w:tc>
-          <w:tcPr>
-            <w:tcW w:type="dxa" w:w="3160"/>
-            <w:tcBorders>
-              <w:top w:val="single" w:color="CBD5E0" w:sz="4"/>
-              <w:left w:val="single" w:color="CBD5E0" w:sz="4"/>
-              <w:bottom w:val="single" w:color="CBD5E0" w:sz="4"/>
-              <w:right w:val="single" w:color="CBD5E0" w:sz="4"/>
-            </w:tcBorders>
-            <w:vAlign w:val="top"/>
-          </w:tcPr>
-          <w:p>
-            <w:pPr>
-              <w:spacing w:after="60" w:before="60"/>
+                <w:sz w:val="17"/>
+                <w:szCs w:val="17"/>
+              </w:rPr>
+              <w:t xml:space="preserve">Not Currently Captured</w:t>
+            </w:r>
+          </w:p>
+        </w:tc>
+        <w:tc>
+          <w:tcPr>
+            <w:tcW w:type="dxa" w:w="3200"/>
+            <w:tcBorders>
+              <w:top w:val="single" w:color="CBD5E0" w:sz="4"/>
+              <w:left w:val="single" w:color="CBD5E0" w:sz="4"/>
+              <w:bottom w:val="single" w:color="CBD5E0" w:sz="4"/>
+              <w:right w:val="single" w:color="CBD5E0" w:sz="4"/>
+            </w:tcBorders>
+            <w:vAlign w:val="top"/>
+          </w:tcPr>
+          <w:p>
+            <w:pPr>
+              <w:spacing w:after="100" w:before="100"/>
             </w:pPr>
             <w:r>
               <w:rPr>
@@ -1742,44 +1732,44 @@
         </w:tc>
         <w:tc>
           <w:tcPr>
-            <w:tcW w:type="dxa" w:w="3460"/>
-            <w:tcBorders>
-              <w:top w:val="single" w:color="CBD5E0" w:sz="4"/>
-              <w:left w:val="single" w:color="CBD5E0" w:sz="4"/>
-              <w:bottom w:val="single" w:color="CBD5E0" w:sz="4"/>
-              <w:right w:val="single" w:color="CBD5E0" w:sz="4"/>
-            </w:tcBorders>
-            <w:vAlign w:val="top"/>
-          </w:tcPr>
-          <w:p>
-            <w:pPr>
-              <w:spacing w:after="60" w:before="60"/>
-            </w:pPr>
-            <w:r>
-              <w:rPr>
-                <w:rFonts w:ascii="Calibri" w:cs="Calibri" w:eastAsia="Calibri" w:hAnsi="Calibri"/>
-                <w:color w:val="4A5568"/>
-                <w:sz w:val="18"/>
-                <w:szCs w:val="18"/>
-              </w:rPr>
-              <w:t xml:space="preserve">Release status, approximate customer or account count, and segment adoption are not currently captured by the skill. This information may be sourced from the skill or from a separate launch status document.</w:t>
-            </w:r>
-          </w:p>
-        </w:tc>
-        <w:tc>
-          <w:tcPr>
-            <w:tcW w:type="dxa" w:w="4160"/>
-            <w:tcBorders>
-              <w:top w:val="single" w:color="CBD5E0" w:sz="4"/>
-              <w:left w:val="single" w:color="CBD5E0" w:sz="4"/>
-              <w:bottom w:val="single" w:color="CBD5E0" w:sz="4"/>
-              <w:right w:val="single" w:color="CBD5E0" w:sz="4"/>
-            </w:tcBorders>
-            <w:vAlign w:val="top"/>
-          </w:tcPr>
-          <w:p>
-            <w:pPr>
-              <w:spacing w:after="60" w:before="60"/>
+            <w:tcW w:type="dxa" w:w="3600"/>
+            <w:tcBorders>
+              <w:top w:val="single" w:color="CBD5E0" w:sz="4"/>
+              <w:left w:val="single" w:color="CBD5E0" w:sz="4"/>
+              <w:bottom w:val="single" w:color="CBD5E0" w:sz="4"/>
+              <w:right w:val="single" w:color="CBD5E0" w:sz="4"/>
+            </w:tcBorders>
+            <w:vAlign w:val="top"/>
+          </w:tcPr>
+          <w:p>
+            <w:pPr>
+              <w:spacing w:after="100" w:before="100"/>
+            </w:pPr>
+            <w:r>
+              <w:rPr>
+                <w:rFonts w:ascii="Calibri" w:cs="Calibri" w:eastAsia="Calibri" w:hAnsi="Calibri"/>
+                <w:color w:val="4A5568"/>
+                <w:sz w:val="18"/>
+                <w:szCs w:val="18"/>
+              </w:rPr>
+              <w:t xml:space="preserve">Release status, approximate customer or account count, and segment adoption are not currently captured by the skill and may already exist in another Product artifact or launch status document.</w:t>
+            </w:r>
+          </w:p>
+        </w:tc>
+        <w:tc>
+          <w:tcPr>
+            <w:tcW w:type="dxa" w:w="4200"/>
+            <w:tcBorders>
+              <w:top w:val="single" w:color="CBD5E0" w:sz="4"/>
+              <w:left w:val="single" w:color="CBD5E0" w:sz="4"/>
+              <w:bottom w:val="single" w:color="CBD5E0" w:sz="4"/>
+              <w:right w:val="single" w:color="CBD5E0" w:sz="4"/>
+            </w:tcBorders>
+            <w:vAlign w:val="top"/>
+          </w:tcPr>
+          <w:p>
+            <w:pPr>
+              <w:spacing w:after="100" w:before="100"/>
             </w:pPr>
             <w:r>
               <w:rPr>
@@ -1807,7 +1797,7 @@
           </w:tcPr>
           <w:p>
             <w:pPr>
-              <w:spacing w:after="60" w:before="60"/>
+              <w:spacing w:after="100" w:before="100"/>
             </w:pPr>
             <w:r>
               <w:rPr>
@@ -1838,7 +1828,7 @@
           </w:tcPr>
           <w:p>
             <w:pPr>
-              <w:spacing w:after="40" w:before="60"/>
+              <w:spacing w:after="40" w:before="100"/>
             </w:pPr>
             <w:r>
               <w:rPr>
@@ -1854,7 +1844,7 @@
           </w:p>
           <w:p>
             <w:pPr>
-              <w:spacing w:after="60" w:before="0"/>
+              <w:spacing w:after="100" w:before="0"/>
             </w:pPr>
             <w:r>
               <w:rPr>
@@ -1871,7 +1861,7 @@
         </w:tc>
         <w:tc>
           <w:tcPr>
-            <w:tcW w:type="dxa" w:w="1200"/>
+            <w:tcW w:type="dxa" w:w="1268"/>
             <w:tcBorders>
               <w:top w:val="single" w:color="CBD5E0" w:sz="4"/>
               <w:left w:val="single" w:color="CBD5E0" w:sz="4"/>
@@ -1883,7 +1873,7 @@
           </w:tcPr>
           <w:p>
             <w:pPr>
-              <w:spacing w:after="60" w:before="60"/>
+              <w:spacing w:after="100" w:before="100"/>
               <w:jc w:val="center"/>
             </w:pPr>
             <w:r>
@@ -1892,8 +1882,8 @@
                 <w:b/>
                 <w:bCs/>
                 <w:color w:val="276749"/>
-                <w:sz w:val="18"/>
-                <w:szCs w:val="18"/>
+                <w:sz w:val="17"/>
+                <w:szCs w:val="17"/>
               </w:rPr>
               <w:t xml:space="preserve">Well Covered</w:t>
             </w:r>
@@ -1901,18 +1891,18 @@
         </w:tc>
         <w:tc>
           <w:tcPr>
-            <w:tcW w:type="dxa" w:w="3160"/>
-            <w:tcBorders>
-              <w:top w:val="single" w:color="CBD5E0" w:sz="4"/>
-              <w:left w:val="single" w:color="CBD5E0" w:sz="4"/>
-              <w:bottom w:val="single" w:color="CBD5E0" w:sz="4"/>
-              <w:right w:val="single" w:color="CBD5E0" w:sz="4"/>
-            </w:tcBorders>
-            <w:vAlign w:val="top"/>
-          </w:tcPr>
-          <w:p>
-            <w:pPr>
-              <w:spacing w:after="60" w:before="60"/>
+            <w:tcW w:type="dxa" w:w="3200"/>
+            <w:tcBorders>
+              <w:top w:val="single" w:color="CBD5E0" w:sz="4"/>
+              <w:left w:val="single" w:color="CBD5E0" w:sz="4"/>
+              <w:bottom w:val="single" w:color="CBD5E0" w:sz="4"/>
+              <w:right w:val="single" w:color="CBD5E0" w:sz="4"/>
+            </w:tcBorders>
+            <w:vAlign w:val="top"/>
+          </w:tcPr>
+          <w:p>
+            <w:pPr>
+              <w:spacing w:after="100" w:before="100"/>
             </w:pPr>
             <w:r>
               <w:rPr>
@@ -1927,7 +1917,7 @@
         </w:tc>
         <w:tc>
           <w:tcPr>
-            <w:tcW w:type="dxa" w:w="3460"/>
+            <w:tcW w:type="dxa" w:w="3600"/>
             <w:tcBorders>
               <w:top w:val="single" w:color="CBD5E0" w:sz="4"/>
               <w:left w:val="single" w:color="CBD5E0" w:sz="4"/>
@@ -1939,7 +1929,7 @@
           </w:tcPr>
           <w:p>
             <w:pPr>
-              <w:spacing w:after="60" w:before="60"/>
+              <w:spacing w:after="100" w:before="100"/>
             </w:pPr>
             <w:r>
               <w:rPr>
@@ -1954,18 +1944,18 @@
         </w:tc>
         <w:tc>
           <w:tcPr>
-            <w:tcW w:type="dxa" w:w="4160"/>
-            <w:tcBorders>
-              <w:top w:val="single" w:color="CBD5E0" w:sz="4"/>
-              <w:left w:val="single" w:color="CBD5E0" w:sz="4"/>
-              <w:bottom w:val="single" w:color="CBD5E0" w:sz="4"/>
-              <w:right w:val="single" w:color="CBD5E0" w:sz="4"/>
-            </w:tcBorders>
-            <w:vAlign w:val="top"/>
-          </w:tcPr>
-          <w:p>
-            <w:pPr>
-              <w:spacing w:after="60" w:before="60"/>
+            <w:tcW w:type="dxa" w:w="4200"/>
+            <w:tcBorders>
+              <w:top w:val="single" w:color="CBD5E0" w:sz="4"/>
+              <w:left w:val="single" w:color="CBD5E0" w:sz="4"/>
+              <w:bottom w:val="single" w:color="CBD5E0" w:sz="4"/>
+              <w:right w:val="single" w:color="CBD5E0" w:sz="4"/>
+            </w:tcBorders>
+            <w:vAlign w:val="top"/>
+          </w:tcPr>
+          <w:p>
+            <w:pPr>
+              <w:spacing w:after="100" w:before="100"/>
             </w:pPr>
             <w:r>
               <w:rPr>
@@ -1994,7 +1984,7 @@
           </w:tcPr>
           <w:p>
             <w:pPr>
-              <w:spacing w:after="40" w:before="60"/>
+              <w:spacing w:after="40" w:before="100"/>
             </w:pPr>
             <w:r>
               <w:rPr>
@@ -2010,7 +2000,7 @@
           </w:p>
           <w:p>
             <w:pPr>
-              <w:spacing w:after="60" w:before="0"/>
+              <w:spacing w:after="100" w:before="0"/>
             </w:pPr>
             <w:r>
               <w:rPr>
@@ -2027,7 +2017,7 @@
         </w:tc>
         <w:tc>
           <w:tcPr>
-            <w:tcW w:type="dxa" w:w="1200"/>
+            <w:tcW w:type="dxa" w:w="1268"/>
             <w:tcBorders>
               <w:top w:val="single" w:color="CBD5E0" w:sz="4"/>
               <w:left w:val="single" w:color="CBD5E0" w:sz="4"/>
@@ -2039,7 +2029,7 @@
           </w:tcPr>
           <w:p>
             <w:pPr>
-              <w:spacing w:after="60" w:before="60"/>
+              <w:spacing w:after="100" w:before="100"/>
               <w:jc w:val="center"/>
             </w:pPr>
             <w:r>
@@ -2048,8 +2038,8 @@
                 <w:b/>
                 <w:bCs/>
                 <w:color w:val="92400E"/>
-                <w:sz w:val="18"/>
-                <w:szCs w:val="18"/>
+                <w:sz w:val="17"/>
+                <w:szCs w:val="17"/>
               </w:rPr>
               <w:t xml:space="preserve">Partially Covered</w:t>
             </w:r>
@@ -2057,18 +2047,18 @@
         </w:tc>
         <w:tc>
           <w:tcPr>
-            <w:tcW w:type="dxa" w:w="3160"/>
-            <w:tcBorders>
-              <w:top w:val="single" w:color="CBD5E0" w:sz="4"/>
-              <w:left w:val="single" w:color="CBD5E0" w:sz="4"/>
-              <w:bottom w:val="single" w:color="CBD5E0" w:sz="4"/>
-              <w:right w:val="single" w:color="CBD5E0" w:sz="4"/>
-            </w:tcBorders>
-            <w:vAlign w:val="top"/>
-          </w:tcPr>
-          <w:p>
-            <w:pPr>
-              <w:spacing w:after="60" w:before="60"/>
+            <w:tcW w:type="dxa" w:w="3200"/>
+            <w:tcBorders>
+              <w:top w:val="single" w:color="CBD5E0" w:sz="4"/>
+              <w:left w:val="single" w:color="CBD5E0" w:sz="4"/>
+              <w:bottom w:val="single" w:color="CBD5E0" w:sz="4"/>
+              <w:right w:val="single" w:color="CBD5E0" w:sz="4"/>
+            </w:tcBorders>
+            <w:vAlign w:val="top"/>
+          </w:tcPr>
+          <w:p>
+            <w:pPr>
+              <w:spacing w:after="100" w:before="100"/>
             </w:pPr>
             <w:r>
               <w:rPr>
@@ -2083,53 +2073,53 @@
         </w:tc>
         <w:tc>
           <w:tcPr>
-            <w:tcW w:type="dxa" w:w="3460"/>
-            <w:tcBorders>
-              <w:top w:val="single" w:color="CBD5E0" w:sz="4"/>
-              <w:left w:val="single" w:color="CBD5E0" w:sz="4"/>
-              <w:bottom w:val="single" w:color="CBD5E0" w:sz="4"/>
-              <w:right w:val="single" w:color="CBD5E0" w:sz="4"/>
-            </w:tcBorders>
-            <w:vAlign w:val="top"/>
-          </w:tcPr>
-          <w:p>
-            <w:pPr>
-              <w:spacing w:after="60" w:before="60"/>
-            </w:pPr>
-            <w:r>
-              <w:rPr>
-                <w:rFonts w:ascii="Calibri" w:cs="Calibri" w:eastAsia="Calibri" w:hAnsi="Calibri"/>
-                <w:color w:val="4A5568"/>
-                <w:sz w:val="18"/>
-                <w:szCs w:val="18"/>
-              </w:rPr>
-              <w:t xml:space="preserve">Trigger conditions, the end state when the workflow completes, and a link to workflow documentation are not currently captured. A reference or link to existing documentation (Confluence, Loom, or diagram) would be sufficient — no additional writing required.</w:t>
-            </w:r>
-          </w:p>
-        </w:tc>
-        <w:tc>
-          <w:tcPr>
-            <w:tcW w:type="dxa" w:w="4160"/>
-            <w:tcBorders>
-              <w:top w:val="single" w:color="CBD5E0" w:sz="4"/>
-              <w:left w:val="single" w:color="CBD5E0" w:sz="4"/>
-              <w:bottom w:val="single" w:color="CBD5E0" w:sz="4"/>
-              <w:right w:val="single" w:color="CBD5E0" w:sz="4"/>
-            </w:tcBorders>
-            <w:vAlign w:val="top"/>
-          </w:tcPr>
-          <w:p>
-            <w:pPr>
-              <w:spacing w:after="60" w:before="60"/>
-            </w:pPr>
-            <w:r>
-              <w:rPr>
-                <w:rFonts w:ascii="Calibri" w:cs="Calibri" w:eastAsia="Calibri" w:hAnsi="Calibri"/>
-                <w:color w:val="4A5568"/>
-                <w:sz w:val="18"/>
-                <w:szCs w:val="18"/>
-              </w:rPr>
-              <w:t xml:space="preserve">Demo scripts, help content, and training materials — including IQ champions onboarding — are built from workflow detail. A pointer reduces the effort of tracking it down separately.</w:t>
+            <w:tcW w:type="dxa" w:w="3600"/>
+            <w:tcBorders>
+              <w:top w:val="single" w:color="CBD5E0" w:sz="4"/>
+              <w:left w:val="single" w:color="CBD5E0" w:sz="4"/>
+              <w:bottom w:val="single" w:color="CBD5E0" w:sz="4"/>
+              <w:right w:val="single" w:color="CBD5E0" w:sz="4"/>
+            </w:tcBorders>
+            <w:vAlign w:val="top"/>
+          </w:tcPr>
+          <w:p>
+            <w:pPr>
+              <w:spacing w:after="100" w:before="100"/>
+            </w:pPr>
+            <w:r>
+              <w:rPr>
+                <w:rFonts w:ascii="Calibri" w:cs="Calibri" w:eastAsia="Calibri" w:hAnsi="Calibri"/>
+                <w:color w:val="4A5568"/>
+                <w:sz w:val="18"/>
+                <w:szCs w:val="18"/>
+              </w:rPr>
+              <w:t xml:space="preserve">Trigger conditions, the end state when the workflow completes, and a reference to workflow documentation are not currently captured by the skill and may already exist in another Product artifact such as a Confluence page, Loom recording, or diagram.</w:t>
+            </w:r>
+          </w:p>
+        </w:tc>
+        <w:tc>
+          <w:tcPr>
+            <w:tcW w:type="dxa" w:w="4200"/>
+            <w:tcBorders>
+              <w:top w:val="single" w:color="CBD5E0" w:sz="4"/>
+              <w:left w:val="single" w:color="CBD5E0" w:sz="4"/>
+              <w:bottom w:val="single" w:color="CBD5E0" w:sz="4"/>
+              <w:right w:val="single" w:color="CBD5E0" w:sz="4"/>
+            </w:tcBorders>
+            <w:vAlign w:val="top"/>
+          </w:tcPr>
+          <w:p>
+            <w:pPr>
+              <w:spacing w:after="100" w:before="100"/>
+            </w:pPr>
+            <w:r>
+              <w:rPr>
+                <w:rFonts w:ascii="Calibri" w:cs="Calibri" w:eastAsia="Calibri" w:hAnsi="Calibri"/>
+                <w:color w:val="4A5568"/>
+                <w:sz w:val="18"/>
+                <w:szCs w:val="18"/>
+              </w:rPr>
+              <w:t xml:space="preserve">Demo scripts, help content, and training materials — including IQ champions onboarding — are built from workflow detail. A reference to existing documentation reduces the effort of tracking it down separately.</w:t>
             </w:r>
           </w:p>
         </w:tc>
@@ -2149,7 +2139,7 @@
           </w:tcPr>
           <w:p>
             <w:pPr>
-              <w:spacing w:after="40" w:before="60"/>
+              <w:spacing w:after="40" w:before="100"/>
             </w:pPr>
             <w:r>
               <w:rPr>
@@ -2165,7 +2155,7 @@
           </w:p>
           <w:p>
             <w:pPr>
-              <w:spacing w:after="60" w:before="0"/>
+              <w:spacing w:after="100" w:before="0"/>
             </w:pPr>
             <w:r>
               <w:rPr>
@@ -2182,7 +2172,7 @@
         </w:tc>
         <w:tc>
           <w:tcPr>
-            <w:tcW w:type="dxa" w:w="1200"/>
+            <w:tcW w:type="dxa" w:w="1268"/>
             <w:tcBorders>
               <w:top w:val="single" w:color="CBD5E0" w:sz="4"/>
               <w:left w:val="single" w:color="CBD5E0" w:sz="4"/>
@@ -2194,7 +2184,7 @@
           </w:tcPr>
           <w:p>
             <w:pPr>
-              <w:spacing w:after="60" w:before="60"/>
+              <w:spacing w:after="100" w:before="100"/>
               <w:jc w:val="center"/>
             </w:pPr>
             <w:r>
@@ -2203,8 +2193,8 @@
                 <w:b/>
                 <w:bCs/>
                 <w:color w:val="92400E"/>
-                <w:sz w:val="18"/>
-                <w:szCs w:val="18"/>
+                <w:sz w:val="17"/>
+                <w:szCs w:val="17"/>
               </w:rPr>
               <w:t xml:space="preserve">Partially Covered</w:t>
             </w:r>
@@ -2212,18 +2202,18 @@
         </w:tc>
         <w:tc>
           <w:tcPr>
-            <w:tcW w:type="dxa" w:w="3160"/>
-            <w:tcBorders>
-              <w:top w:val="single" w:color="CBD5E0" w:sz="4"/>
-              <w:left w:val="single" w:color="CBD5E0" w:sz="4"/>
-              <w:bottom w:val="single" w:color="CBD5E0" w:sz="4"/>
-              <w:right w:val="single" w:color="CBD5E0" w:sz="4"/>
-            </w:tcBorders>
-            <w:vAlign w:val="top"/>
-          </w:tcPr>
-          <w:p>
-            <w:pPr>
-              <w:spacing w:after="60" w:before="60"/>
+            <w:tcW w:type="dxa" w:w="3200"/>
+            <w:tcBorders>
+              <w:top w:val="single" w:color="CBD5E0" w:sz="4"/>
+              <w:left w:val="single" w:color="CBD5E0" w:sz="4"/>
+              <w:bottom w:val="single" w:color="CBD5E0" w:sz="4"/>
+              <w:right w:val="single" w:color="CBD5E0" w:sz="4"/>
+            </w:tcBorders>
+            <w:vAlign w:val="top"/>
+          </w:tcPr>
+          <w:p>
+            <w:pPr>
+              <w:spacing w:after="100" w:before="100"/>
             </w:pPr>
             <w:r>
               <w:rPr>
@@ -2238,44 +2228,44 @@
         </w:tc>
         <w:tc>
           <w:tcPr>
-            <w:tcW w:type="dxa" w:w="3460"/>
-            <w:tcBorders>
-              <w:top w:val="single" w:color="CBD5E0" w:sz="4"/>
-              <w:left w:val="single" w:color="CBD5E0" w:sz="4"/>
-              <w:bottom w:val="single" w:color="CBD5E0" w:sz="4"/>
-              <w:right w:val="single" w:color="CBD5E0" w:sz="4"/>
-            </w:tcBorders>
-            <w:vAlign w:val="top"/>
-          </w:tcPr>
-          <w:p>
-            <w:pPr>
-              <w:spacing w:after="60" w:before="60"/>
-            </w:pPr>
-            <w:r>
-              <w:rPr>
-                <w:rFonts w:ascii="Calibri" w:cs="Calibri" w:eastAsia="Calibri" w:hAnsi="Calibri"/>
-                <w:color w:val="4A5568"/>
-                <w:sz w:val="18"/>
-                <w:szCs w:val="18"/>
-              </w:rPr>
-              <w:t xml:space="preserve">A structured capability list, three to five named use cases (persona, task, outcome), and explicit non-use cases are not currently captured. These may be sourced through the skill or referenced from an existing Shift Left or product brief.</w:t>
-            </w:r>
-          </w:p>
-        </w:tc>
-        <w:tc>
-          <w:tcPr>
-            <w:tcW w:type="dxa" w:w="4160"/>
-            <w:tcBorders>
-              <w:top w:val="single" w:color="CBD5E0" w:sz="4"/>
-              <w:left w:val="single" w:color="CBD5E0" w:sz="4"/>
-              <w:bottom w:val="single" w:color="CBD5E0" w:sz="4"/>
-              <w:right w:val="single" w:color="CBD5E0" w:sz="4"/>
-            </w:tcBorders>
-            <w:vAlign w:val="top"/>
-          </w:tcPr>
-          <w:p>
-            <w:pPr>
-              <w:spacing w:after="60" w:before="60"/>
+            <w:tcW w:type="dxa" w:w="3600"/>
+            <w:tcBorders>
+              <w:top w:val="single" w:color="CBD5E0" w:sz="4"/>
+              <w:left w:val="single" w:color="CBD5E0" w:sz="4"/>
+              <w:bottom w:val="single" w:color="CBD5E0" w:sz="4"/>
+              <w:right w:val="single" w:color="CBD5E0" w:sz="4"/>
+            </w:tcBorders>
+            <w:vAlign w:val="top"/>
+          </w:tcPr>
+          <w:p>
+            <w:pPr>
+              <w:spacing w:after="100" w:before="100"/>
+            </w:pPr>
+            <w:r>
+              <w:rPr>
+                <w:rFonts w:ascii="Calibri" w:cs="Calibri" w:eastAsia="Calibri" w:hAnsi="Calibri"/>
+                <w:color w:val="4A5568"/>
+                <w:sz w:val="18"/>
+                <w:szCs w:val="18"/>
+              </w:rPr>
+              <w:t xml:space="preserve">A structured capability list, three to five named use cases (persona, task, outcome), and explicit non-use cases are not currently captured by the skill and may already exist in a Shift Left document or product brief.</w:t>
+            </w:r>
+          </w:p>
+        </w:tc>
+        <w:tc>
+          <w:tcPr>
+            <w:tcW w:type="dxa" w:w="4200"/>
+            <w:tcBorders>
+              <w:top w:val="single" w:color="CBD5E0" w:sz="4"/>
+              <w:left w:val="single" w:color="CBD5E0" w:sz="4"/>
+              <w:bottom w:val="single" w:color="CBD5E0" w:sz="4"/>
+              <w:right w:val="single" w:color="CBD5E0" w:sz="4"/>
+            </w:tcBorders>
+            <w:vAlign w:val="top"/>
+          </w:tcPr>
+          <w:p>
+            <w:pPr>
+              <w:spacing w:after="100" w:before="100"/>
             </w:pPr>
             <w:r>
               <w:rPr>
@@ -2304,7 +2294,7 @@
           </w:tcPr>
           <w:p>
             <w:pPr>
-              <w:spacing w:after="40" w:before="60"/>
+              <w:spacing w:after="40" w:before="100"/>
             </w:pPr>
             <w:r>
               <w:rPr>
@@ -2320,7 +2310,7 @@
           </w:p>
           <w:p>
             <w:pPr>
-              <w:spacing w:after="60" w:before="0"/>
+              <w:spacing w:after="100" w:before="0"/>
             </w:pPr>
             <w:r>
               <w:rPr>
@@ -2337,7 +2327,7 @@
         </w:tc>
         <w:tc>
           <w:tcPr>
-            <w:tcW w:type="dxa" w:w="1200"/>
+            <w:tcW w:type="dxa" w:w="1268"/>
             <w:tcBorders>
               <w:top w:val="single" w:color="CBD5E0" w:sz="4"/>
               <w:left w:val="single" w:color="CBD5E0" w:sz="4"/>
@@ -2349,7 +2339,7 @@
           </w:tcPr>
           <w:p>
             <w:pPr>
-              <w:spacing w:after="60" w:before="60"/>
+              <w:spacing w:after="100" w:before="100"/>
               <w:jc w:val="center"/>
             </w:pPr>
             <w:r>
@@ -2358,8 +2348,8 @@
                 <w:b/>
                 <w:bCs/>
                 <w:color w:val="92400E"/>
-                <w:sz w:val="18"/>
-                <w:szCs w:val="18"/>
+                <w:sz w:val="17"/>
+                <w:szCs w:val="17"/>
               </w:rPr>
               <w:t xml:space="preserve">Partially Covered</w:t>
             </w:r>
@@ -2367,18 +2357,18 @@
         </w:tc>
         <w:tc>
           <w:tcPr>
-            <w:tcW w:type="dxa" w:w="3160"/>
-            <w:tcBorders>
-              <w:top w:val="single" w:color="CBD5E0" w:sz="4"/>
-              <w:left w:val="single" w:color="CBD5E0" w:sz="4"/>
-              <w:bottom w:val="single" w:color="CBD5E0" w:sz="4"/>
-              <w:right w:val="single" w:color="CBD5E0" w:sz="4"/>
-            </w:tcBorders>
-            <w:vAlign w:val="top"/>
-          </w:tcPr>
-          <w:p>
-            <w:pPr>
-              <w:spacing w:after="60" w:before="60"/>
+            <w:tcW w:type="dxa" w:w="3200"/>
+            <w:tcBorders>
+              <w:top w:val="single" w:color="CBD5E0" w:sz="4"/>
+              <w:left w:val="single" w:color="CBD5E0" w:sz="4"/>
+              <w:bottom w:val="single" w:color="CBD5E0" w:sz="4"/>
+              <w:right w:val="single" w:color="CBD5E0" w:sz="4"/>
+            </w:tcBorders>
+            <w:vAlign w:val="top"/>
+          </w:tcPr>
+          <w:p>
+            <w:pPr>
+              <w:spacing w:after="100" w:before="100"/>
             </w:pPr>
             <w:r>
               <w:rPr>
@@ -2393,44 +2383,44 @@
         </w:tc>
         <w:tc>
           <w:tcPr>
-            <w:tcW w:type="dxa" w:w="3460"/>
-            <w:tcBorders>
-              <w:top w:val="single" w:color="CBD5E0" w:sz="4"/>
-              <w:left w:val="single" w:color="CBD5E0" w:sz="4"/>
-              <w:bottom w:val="single" w:color="CBD5E0" w:sz="4"/>
-              <w:right w:val="single" w:color="CBD5E0" w:sz="4"/>
-            </w:tcBorders>
-            <w:vAlign w:val="top"/>
-          </w:tcPr>
-          <w:p>
-            <w:pPr>
-              <w:spacing w:after="60" w:before="60"/>
-            </w:pPr>
-            <w:r>
-              <w:rPr>
-                <w:rFonts w:ascii="Calibri" w:cs="Calibri" w:eastAsia="Calibri" w:hAnsi="Calibri"/>
-                <w:color w:val="4A5568"/>
-                <w:sz w:val="18"/>
-                <w:szCs w:val="18"/>
-              </w:rPr>
-              <w:t xml:space="preserve">Volume caps, compatibility gaps, known issues not fixed at launch, and deliberate design trade-offs are not currently captured as structured inputs. A brief note or link to existing engineering documentation would suffice.</w:t>
-            </w:r>
-          </w:p>
-        </w:tc>
-        <w:tc>
-          <w:tcPr>
-            <w:tcW w:type="dxa" w:w="4160"/>
-            <w:tcBorders>
-              <w:top w:val="single" w:color="CBD5E0" w:sz="4"/>
-              <w:left w:val="single" w:color="CBD5E0" w:sz="4"/>
-              <w:bottom w:val="single" w:color="CBD5E0" w:sz="4"/>
-              <w:right w:val="single" w:color="CBD5E0" w:sz="4"/>
-            </w:tcBorders>
-            <w:vAlign w:val="top"/>
-          </w:tcPr>
-          <w:p>
-            <w:pPr>
-              <w:spacing w:after="60" w:before="60"/>
+            <w:tcW w:type="dxa" w:w="3600"/>
+            <w:tcBorders>
+              <w:top w:val="single" w:color="CBD5E0" w:sz="4"/>
+              <w:left w:val="single" w:color="CBD5E0" w:sz="4"/>
+              <w:bottom w:val="single" w:color="CBD5E0" w:sz="4"/>
+              <w:right w:val="single" w:color="CBD5E0" w:sz="4"/>
+            </w:tcBorders>
+            <w:vAlign w:val="top"/>
+          </w:tcPr>
+          <w:p>
+            <w:pPr>
+              <w:spacing w:after="100" w:before="100"/>
+            </w:pPr>
+            <w:r>
+              <w:rPr>
+                <w:rFonts w:ascii="Calibri" w:cs="Calibri" w:eastAsia="Calibri" w:hAnsi="Calibri"/>
+                <w:color w:val="4A5568"/>
+                <w:sz w:val="18"/>
+                <w:szCs w:val="18"/>
+              </w:rPr>
+              <w:t xml:space="preserve">Volume caps, compatibility gaps, known issues not fixed at launch, and deliberate design trade-offs are not currently captured by the skill and may already exist in engineering documentation.</w:t>
+            </w:r>
+          </w:p>
+        </w:tc>
+        <w:tc>
+          <w:tcPr>
+            <w:tcW w:type="dxa" w:w="4200"/>
+            <w:tcBorders>
+              <w:top w:val="single" w:color="CBD5E0" w:sz="4"/>
+              <w:left w:val="single" w:color="CBD5E0" w:sz="4"/>
+              <w:bottom w:val="single" w:color="CBD5E0" w:sz="4"/>
+              <w:right w:val="single" w:color="CBD5E0" w:sz="4"/>
+            </w:tcBorders>
+            <w:vAlign w:val="top"/>
+          </w:tcPr>
+          <w:p>
+            <w:pPr>
+              <w:spacing w:after="100" w:before="100"/>
             </w:pPr>
             <w:r>
               <w:rPr>
@@ -2459,7 +2449,7 @@
           </w:tcPr>
           <w:p>
             <w:pPr>
-              <w:spacing w:after="40" w:before="60"/>
+              <w:spacing w:after="40" w:before="100"/>
             </w:pPr>
             <w:r>
               <w:rPr>
@@ -2475,7 +2465,7 @@
           </w:p>
           <w:p>
             <w:pPr>
-              <w:spacing w:after="60" w:before="0"/>
+              <w:spacing w:after="100" w:before="0"/>
             </w:pPr>
             <w:r>
               <w:rPr>
@@ -2492,7 +2482,7 @@
         </w:tc>
         <w:tc>
           <w:tcPr>
-            <w:tcW w:type="dxa" w:w="1200"/>
+            <w:tcW w:type="dxa" w:w="1268"/>
             <w:tcBorders>
               <w:top w:val="single" w:color="CBD5E0" w:sz="4"/>
               <w:left w:val="single" w:color="CBD5E0" w:sz="4"/>
@@ -2504,7 +2494,7 @@
           </w:tcPr>
           <w:p>
             <w:pPr>
-              <w:spacing w:after="60" w:before="60"/>
+              <w:spacing w:after="100" w:before="100"/>
               <w:jc w:val="center"/>
             </w:pPr>
             <w:r>
@@ -2513,27 +2503,27 @@
                 <w:b/>
                 <w:bCs/>
                 <w:color w:val="1E40AF"/>
-                <w:sz w:val="18"/>
-                <w:szCs w:val="18"/>
-              </w:rPr>
-              <w:t xml:space="preserve">Opportunity</w:t>
-            </w:r>
-          </w:p>
-        </w:tc>
-        <w:tc>
-          <w:tcPr>
-            <w:tcW w:type="dxa" w:w="3160"/>
-            <w:tcBorders>
-              <w:top w:val="single" w:color="CBD5E0" w:sz="4"/>
-              <w:left w:val="single" w:color="CBD5E0" w:sz="4"/>
-              <w:bottom w:val="single" w:color="CBD5E0" w:sz="4"/>
-              <w:right w:val="single" w:color="CBD5E0" w:sz="4"/>
-            </w:tcBorders>
-            <w:vAlign w:val="top"/>
-          </w:tcPr>
-          <w:p>
-            <w:pPr>
-              <w:spacing w:after="60" w:before="60"/>
+                <w:sz w:val="17"/>
+                <w:szCs w:val="17"/>
+              </w:rPr>
+              <w:t xml:space="preserve">Not Currently Captured</w:t>
+            </w:r>
+          </w:p>
+        </w:tc>
+        <w:tc>
+          <w:tcPr>
+            <w:tcW w:type="dxa" w:w="3200"/>
+            <w:tcBorders>
+              <w:top w:val="single" w:color="CBD5E0" w:sz="4"/>
+              <w:left w:val="single" w:color="CBD5E0" w:sz="4"/>
+              <w:bottom w:val="single" w:color="CBD5E0" w:sz="4"/>
+              <w:right w:val="single" w:color="CBD5E0" w:sz="4"/>
+            </w:tcBorders>
+            <w:vAlign w:val="top"/>
+          </w:tcPr>
+          <w:p>
+            <w:pPr>
+              <w:spacing w:after="100" w:before="100"/>
             </w:pPr>
             <w:r>
               <w:rPr>
@@ -2548,44 +2538,44 @@
         </w:tc>
         <w:tc>
           <w:tcPr>
-            <w:tcW w:type="dxa" w:w="3460"/>
-            <w:tcBorders>
-              <w:top w:val="single" w:color="CBD5E0" w:sz="4"/>
-              <w:left w:val="single" w:color="CBD5E0" w:sz="4"/>
-              <w:bottom w:val="single" w:color="CBD5E0" w:sz="4"/>
-              <w:right w:val="single" w:color="CBD5E0" w:sz="4"/>
-            </w:tcBorders>
-            <w:vAlign w:val="top"/>
-          </w:tcPr>
-          <w:p>
-            <w:pPr>
-              <w:spacing w:after="60" w:before="60"/>
-            </w:pPr>
-            <w:r>
-              <w:rPr>
-                <w:rFonts w:ascii="Calibri" w:cs="Calibri" w:eastAsia="Calibri" w:hAnsi="Calibri"/>
-                <w:color w:val="4A5568"/>
-                <w:sz w:val="18"/>
-                <w:szCs w:val="18"/>
-              </w:rPr>
-              <w:t xml:space="preserve">Required product modules, integrations, user permissions, data format requirements, minimum technical environment, and deployment model (Saras-managed vs. customer-managed) are not currently captured. This information may be sourced through the skill or from an existing technical specification.</w:t>
-            </w:r>
-          </w:p>
-        </w:tc>
-        <w:tc>
-          <w:tcPr>
-            <w:tcW w:type="dxa" w:w="4160"/>
-            <w:tcBorders>
-              <w:top w:val="single" w:color="CBD5E0" w:sz="4"/>
-              <w:left w:val="single" w:color="CBD5E0" w:sz="4"/>
-              <w:bottom w:val="single" w:color="CBD5E0" w:sz="4"/>
-              <w:right w:val="single" w:color="CBD5E0" w:sz="4"/>
-            </w:tcBorders>
-            <w:vAlign w:val="top"/>
-          </w:tcPr>
-          <w:p>
-            <w:pPr>
-              <w:spacing w:after="60" w:before="60"/>
+            <w:tcW w:type="dxa" w:w="3600"/>
+            <w:tcBorders>
+              <w:top w:val="single" w:color="CBD5E0" w:sz="4"/>
+              <w:left w:val="single" w:color="CBD5E0" w:sz="4"/>
+              <w:bottom w:val="single" w:color="CBD5E0" w:sz="4"/>
+              <w:right w:val="single" w:color="CBD5E0" w:sz="4"/>
+            </w:tcBorders>
+            <w:vAlign w:val="top"/>
+          </w:tcPr>
+          <w:p>
+            <w:pPr>
+              <w:spacing w:after="100" w:before="100"/>
+            </w:pPr>
+            <w:r>
+              <w:rPr>
+                <w:rFonts w:ascii="Calibri" w:cs="Calibri" w:eastAsia="Calibri" w:hAnsi="Calibri"/>
+                <w:color w:val="4A5568"/>
+                <w:sz w:val="18"/>
+                <w:szCs w:val="18"/>
+              </w:rPr>
+              <w:t xml:space="preserve">Required product modules, integrations, user permissions, data format requirements, minimum technical environment, and deployment model (Saras-managed vs. customer-managed) are not currently captured by the skill and may already exist in an existing technical specification.</w:t>
+            </w:r>
+          </w:p>
+        </w:tc>
+        <w:tc>
+          <w:tcPr>
+            <w:tcW w:type="dxa" w:w="4200"/>
+            <w:tcBorders>
+              <w:top w:val="single" w:color="CBD5E0" w:sz="4"/>
+              <w:left w:val="single" w:color="CBD5E0" w:sz="4"/>
+              <w:bottom w:val="single" w:color="CBD5E0" w:sz="4"/>
+              <w:right w:val="single" w:color="CBD5E0" w:sz="4"/>
+            </w:tcBorders>
+            <w:vAlign w:val="top"/>
+          </w:tcPr>
+          <w:p>
+            <w:pPr>
+              <w:spacing w:after="100" w:before="100"/>
             </w:pPr>
             <w:r>
               <w:rPr>
@@ -2613,7 +2603,7 @@
           </w:tcPr>
           <w:p>
             <w:pPr>
-              <w:spacing w:after="60" w:before="60"/>
+              <w:spacing w:after="100" w:before="100"/>
             </w:pPr>
             <w:r>
               <w:rPr>
@@ -2644,7 +2634,7 @@
           </w:tcPr>
           <w:p>
             <w:pPr>
-              <w:spacing w:after="40" w:before="60"/>
+              <w:spacing w:after="40" w:before="100"/>
             </w:pPr>
             <w:r>
               <w:rPr>
@@ -2660,7 +2650,7 @@
           </w:p>
           <w:p>
             <w:pPr>
-              <w:spacing w:after="60" w:before="0"/>
+              <w:spacing w:after="100" w:before="0"/>
             </w:pPr>
             <w:r>
               <w:rPr>
@@ -2677,7 +2667,7 @@
         </w:tc>
         <w:tc>
           <w:tcPr>
-            <w:tcW w:type="dxa" w:w="1200"/>
+            <w:tcW w:type="dxa" w:w="1268"/>
             <w:tcBorders>
               <w:top w:val="single" w:color="CBD5E0" w:sz="4"/>
               <w:left w:val="single" w:color="CBD5E0" w:sz="4"/>
@@ -2689,7 +2679,7 @@
           </w:tcPr>
           <w:p>
             <w:pPr>
-              <w:spacing w:after="60" w:before="60"/>
+              <w:spacing w:after="100" w:before="100"/>
               <w:jc w:val="center"/>
             </w:pPr>
             <w:r>
@@ -2698,8 +2688,8 @@
                 <w:b/>
                 <w:bCs/>
                 <w:color w:val="92400E"/>
-                <w:sz w:val="18"/>
-                <w:szCs w:val="18"/>
+                <w:sz w:val="17"/>
+                <w:szCs w:val="17"/>
               </w:rPr>
               <w:t xml:space="preserve">Partially Covered</w:t>
             </w:r>
@@ -2707,18 +2697,18 @@
         </w:tc>
         <w:tc>
           <w:tcPr>
-            <w:tcW w:type="dxa" w:w="3160"/>
-            <w:tcBorders>
-              <w:top w:val="single" w:color="CBD5E0" w:sz="4"/>
-              <w:left w:val="single" w:color="CBD5E0" w:sz="4"/>
-              <w:bottom w:val="single" w:color="CBD5E0" w:sz="4"/>
-              <w:right w:val="single" w:color="CBD5E0" w:sz="4"/>
-            </w:tcBorders>
-            <w:vAlign w:val="top"/>
-          </w:tcPr>
-          <w:p>
-            <w:pPr>
-              <w:spacing w:after="60" w:before="60"/>
+            <w:tcW w:type="dxa" w:w="3200"/>
+            <w:tcBorders>
+              <w:top w:val="single" w:color="CBD5E0" w:sz="4"/>
+              <w:left w:val="single" w:color="CBD5E0" w:sz="4"/>
+              <w:bottom w:val="single" w:color="CBD5E0" w:sz="4"/>
+              <w:right w:val="single" w:color="CBD5E0" w:sz="4"/>
+            </w:tcBorders>
+            <w:vAlign w:val="top"/>
+          </w:tcPr>
+          <w:p>
+            <w:pPr>
+              <w:spacing w:after="100" w:before="100"/>
             </w:pPr>
             <w:r>
               <w:rPr>
@@ -2733,44 +2723,44 @@
         </w:tc>
         <w:tc>
           <w:tcPr>
-            <w:tcW w:type="dxa" w:w="3460"/>
-            <w:tcBorders>
-              <w:top w:val="single" w:color="CBD5E0" w:sz="4"/>
-              <w:left w:val="single" w:color="CBD5E0" w:sz="4"/>
-              <w:bottom w:val="single" w:color="CBD5E0" w:sz="4"/>
-              <w:right w:val="single" w:color="CBD5E0" w:sz="4"/>
-            </w:tcBorders>
-            <w:vAlign w:val="top"/>
-          </w:tcPr>
-          <w:p>
-            <w:pPr>
-              <w:spacing w:after="60" w:before="60"/>
-            </w:pPr>
-            <w:r>
-              <w:rPr>
-                <w:rFonts w:ascii="Calibri" w:cs="Calibri" w:eastAsia="Calibri" w:hAnsi="Calibri"/>
-                <w:color w:val="4A5568"/>
-                <w:sz w:val="18"/>
-                <w:szCs w:val="18"/>
-              </w:rPr>
-              <w:t xml:space="preserve">Structured notes on whether production customers, beta participants, or design partners exist — and whether reference customers are available — are not currently captured. A brief factual note alongside the quotes would address this.</w:t>
-            </w:r>
-          </w:p>
-        </w:tc>
-        <w:tc>
-          <w:tcPr>
-            <w:tcW w:type="dxa" w:w="4160"/>
-            <w:tcBorders>
-              <w:top w:val="single" w:color="CBD5E0" w:sz="4"/>
-              <w:left w:val="single" w:color="CBD5E0" w:sz="4"/>
-              <w:bottom w:val="single" w:color="CBD5E0" w:sz="4"/>
-              <w:right w:val="single" w:color="CBD5E0" w:sz="4"/>
-            </w:tcBorders>
-            <w:vAlign w:val="top"/>
-          </w:tcPr>
-          <w:p>
-            <w:pPr>
-              <w:spacing w:after="60" w:before="60"/>
+            <w:tcW w:type="dxa" w:w="3600"/>
+            <w:tcBorders>
+              <w:top w:val="single" w:color="CBD5E0" w:sz="4"/>
+              <w:left w:val="single" w:color="CBD5E0" w:sz="4"/>
+              <w:bottom w:val="single" w:color="CBD5E0" w:sz="4"/>
+              <w:right w:val="single" w:color="CBD5E0" w:sz="4"/>
+            </w:tcBorders>
+            <w:vAlign w:val="top"/>
+          </w:tcPr>
+          <w:p>
+            <w:pPr>
+              <w:spacing w:after="100" w:before="100"/>
+            </w:pPr>
+            <w:r>
+              <w:rPr>
+                <w:rFonts w:ascii="Calibri" w:cs="Calibri" w:eastAsia="Calibri" w:hAnsi="Calibri"/>
+                <w:color w:val="4A5568"/>
+                <w:sz w:val="18"/>
+                <w:szCs w:val="18"/>
+              </w:rPr>
+              <w:t xml:space="preserve">Structured notes on whether production customers, beta participants, or design partners exist — and whether reference customers are available — are not currently captured by the skill and may already exist in another Product artifact.</w:t>
+            </w:r>
+          </w:p>
+        </w:tc>
+        <w:tc>
+          <w:tcPr>
+            <w:tcW w:type="dxa" w:w="4200"/>
+            <w:tcBorders>
+              <w:top w:val="single" w:color="CBD5E0" w:sz="4"/>
+              <w:left w:val="single" w:color="CBD5E0" w:sz="4"/>
+              <w:bottom w:val="single" w:color="CBD5E0" w:sz="4"/>
+              <w:right w:val="single" w:color="CBD5E0" w:sz="4"/>
+            </w:tcBorders>
+            <w:vAlign w:val="top"/>
+          </w:tcPr>
+          <w:p>
+            <w:pPr>
+              <w:spacing w:after="100" w:before="100"/>
             </w:pPr>
             <w:r>
               <w:rPr>
@@ -2799,7 +2789,7 @@
           </w:tcPr>
           <w:p>
             <w:pPr>
-              <w:spacing w:after="40" w:before="60"/>
+              <w:spacing w:after="40" w:before="100"/>
             </w:pPr>
             <w:r>
               <w:rPr>
@@ -2815,7 +2805,7 @@
           </w:p>
           <w:p>
             <w:pPr>
-              <w:spacing w:after="60" w:before="0"/>
+              <w:spacing w:after="100" w:before="0"/>
             </w:pPr>
             <w:r>
               <w:rPr>
@@ -2832,7 +2822,7 @@
         </w:tc>
         <w:tc>
           <w:tcPr>
-            <w:tcW w:type="dxa" w:w="1200"/>
+            <w:tcW w:type="dxa" w:w="1268"/>
             <w:tcBorders>
               <w:top w:val="single" w:color="CBD5E0" w:sz="4"/>
               <w:left w:val="single" w:color="CBD5E0" w:sz="4"/>
@@ -2844,7 +2834,7 @@
           </w:tcPr>
           <w:p>
             <w:pPr>
-              <w:spacing w:after="60" w:before="60"/>
+              <w:spacing w:after="100" w:before="100"/>
               <w:jc w:val="center"/>
             </w:pPr>
             <w:r>
@@ -2853,27 +2843,27 @@
                 <w:b/>
                 <w:bCs/>
                 <w:color w:val="1E40AF"/>
-                <w:sz w:val="18"/>
-                <w:szCs w:val="18"/>
-              </w:rPr>
-              <w:t xml:space="preserve">Opportunity</w:t>
-            </w:r>
-          </w:p>
-        </w:tc>
-        <w:tc>
-          <w:tcPr>
-            <w:tcW w:type="dxa" w:w="3160"/>
-            <w:tcBorders>
-              <w:top w:val="single" w:color="CBD5E0" w:sz="4"/>
-              <w:left w:val="single" w:color="CBD5E0" w:sz="4"/>
-              <w:bottom w:val="single" w:color="CBD5E0" w:sz="4"/>
-              <w:right w:val="single" w:color="CBD5E0" w:sz="4"/>
-            </w:tcBorders>
-            <w:vAlign w:val="top"/>
-          </w:tcPr>
-          <w:p>
-            <w:pPr>
-              <w:spacing w:after="60" w:before="60"/>
+                <w:sz w:val="17"/>
+                <w:szCs w:val="17"/>
+              </w:rPr>
+              <w:t xml:space="preserve">Not Currently Captured</w:t>
+            </w:r>
+          </w:p>
+        </w:tc>
+        <w:tc>
+          <w:tcPr>
+            <w:tcW w:type="dxa" w:w="3200"/>
+            <w:tcBorders>
+              <w:top w:val="single" w:color="CBD5E0" w:sz="4"/>
+              <w:left w:val="single" w:color="CBD5E0" w:sz="4"/>
+              <w:bottom w:val="single" w:color="CBD5E0" w:sz="4"/>
+              <w:right w:val="single" w:color="CBD5E0" w:sz="4"/>
+            </w:tcBorders>
+            <w:vAlign w:val="top"/>
+          </w:tcPr>
+          <w:p>
+            <w:pPr>
+              <w:spacing w:after="100" w:before="100"/>
             </w:pPr>
             <w:r>
               <w:rPr>
@@ -2888,44 +2878,44 @@
         </w:tc>
         <w:tc>
           <w:tcPr>
-            <w:tcW w:type="dxa" w:w="3460"/>
-            <w:tcBorders>
-              <w:top w:val="single" w:color="CBD5E0" w:sz="4"/>
-              <w:left w:val="single" w:color="CBD5E0" w:sz="4"/>
-              <w:bottom w:val="single" w:color="CBD5E0" w:sz="4"/>
-              <w:right w:val="single" w:color="CBD5E0" w:sz="4"/>
-            </w:tcBorders>
-            <w:vAlign w:val="top"/>
-          </w:tcPr>
-          <w:p>
-            <w:pPr>
-              <w:spacing w:after="60" w:before="60"/>
-            </w:pPr>
-            <w:r>
-              <w:rPr>
-                <w:rFonts w:ascii="Calibri" w:cs="Calibri" w:eastAsia="Calibri" w:hAnsi="Calibri"/>
-                <w:color w:val="4A5568"/>
-                <w:sz w:val="18"/>
-                <w:szCs w:val="18"/>
-              </w:rPr>
-              <w:t xml:space="preserve">For each key claim, a note on whether it is validated research or a product assumption — and a pointer to supporting data — is not currently captured. This may be sourced through the skill or from an existing research brief.</w:t>
-            </w:r>
-          </w:p>
-        </w:tc>
-        <w:tc>
-          <w:tcPr>
-            <w:tcW w:type="dxa" w:w="4160"/>
-            <w:tcBorders>
-              <w:top w:val="single" w:color="CBD5E0" w:sz="4"/>
-              <w:left w:val="single" w:color="CBD5E0" w:sz="4"/>
-              <w:bottom w:val="single" w:color="CBD5E0" w:sz="4"/>
-              <w:right w:val="single" w:color="CBD5E0" w:sz="4"/>
-            </w:tcBorders>
-            <w:vAlign w:val="top"/>
-          </w:tcPr>
-          <w:p>
-            <w:pPr>
-              <w:spacing w:after="60" w:before="60"/>
+            <w:tcW w:type="dxa" w:w="3600"/>
+            <w:tcBorders>
+              <w:top w:val="single" w:color="CBD5E0" w:sz="4"/>
+              <w:left w:val="single" w:color="CBD5E0" w:sz="4"/>
+              <w:bottom w:val="single" w:color="CBD5E0" w:sz="4"/>
+              <w:right w:val="single" w:color="CBD5E0" w:sz="4"/>
+            </w:tcBorders>
+            <w:vAlign w:val="top"/>
+          </w:tcPr>
+          <w:p>
+            <w:pPr>
+              <w:spacing w:after="100" w:before="100"/>
+            </w:pPr>
+            <w:r>
+              <w:rPr>
+                <w:rFonts w:ascii="Calibri" w:cs="Calibri" w:eastAsia="Calibri" w:hAnsi="Calibri"/>
+                <w:color w:val="4A5568"/>
+                <w:sz w:val="18"/>
+                <w:szCs w:val="18"/>
+              </w:rPr>
+              <w:t xml:space="preserve">For each key claim, a note on whether it is validated research or a product assumption — and a pointer to supporting data — is not currently captured by the skill and may already exist in a research brief or interview summary.</w:t>
+            </w:r>
+          </w:p>
+        </w:tc>
+        <w:tc>
+          <w:tcPr>
+            <w:tcW w:type="dxa" w:w="4200"/>
+            <w:tcBorders>
+              <w:top w:val="single" w:color="CBD5E0" w:sz="4"/>
+              <w:left w:val="single" w:color="CBD5E0" w:sz="4"/>
+              <w:bottom w:val="single" w:color="CBD5E0" w:sz="4"/>
+              <w:right w:val="single" w:color="CBD5E0" w:sz="4"/>
+            </w:tcBorders>
+            <w:vAlign w:val="top"/>
+          </w:tcPr>
+          <w:p>
+            <w:pPr>
+              <w:spacing w:after="100" w:before="100"/>
             </w:pPr>
             <w:r>
               <w:rPr>
@@ -2953,7 +2943,7 @@
           </w:tcPr>
           <w:p>
             <w:pPr>
-              <w:spacing w:after="60" w:before="60"/>
+              <w:spacing w:after="100" w:before="100"/>
             </w:pPr>
             <w:r>
               <w:rPr>
@@ -2984,7 +2974,7 @@
           </w:tcPr>
           <w:p>
             <w:pPr>
-              <w:spacing w:after="40" w:before="60"/>
+              <w:spacing w:after="40" w:before="100"/>
             </w:pPr>
             <w:r>
               <w:rPr>
@@ -3000,7 +2990,7 @@
           </w:p>
           <w:p>
             <w:pPr>
-              <w:spacing w:after="60" w:before="0"/>
+              <w:spacing w:after="100" w:before="0"/>
             </w:pPr>
             <w:r>
               <w:rPr>
@@ -3017,7 +3007,7 @@
         </w:tc>
         <w:tc>
           <w:tcPr>
-            <w:tcW w:type="dxa" w:w="1200"/>
+            <w:tcW w:type="dxa" w:w="1268"/>
             <w:tcBorders>
               <w:top w:val="single" w:color="CBD5E0" w:sz="4"/>
               <w:left w:val="single" w:color="CBD5E0" w:sz="4"/>
@@ -3029,7 +3019,7 @@
           </w:tcPr>
           <w:p>
             <w:pPr>
-              <w:spacing w:after="60" w:before="60"/>
+              <w:spacing w:after="100" w:before="100"/>
               <w:jc w:val="center"/>
             </w:pPr>
             <w:r>
@@ -3038,8 +3028,8 @@
                 <w:b/>
                 <w:bCs/>
                 <w:color w:val="92400E"/>
-                <w:sz w:val="18"/>
-                <w:szCs w:val="18"/>
+                <w:sz w:val="17"/>
+                <w:szCs w:val="17"/>
               </w:rPr>
               <w:t xml:space="preserve">Partially Covered</w:t>
             </w:r>
@@ -3047,18 +3037,18 @@
         </w:tc>
         <w:tc>
           <w:tcPr>
-            <w:tcW w:type="dxa" w:w="3160"/>
-            <w:tcBorders>
-              <w:top w:val="single" w:color="CBD5E0" w:sz="4"/>
-              <w:left w:val="single" w:color="CBD5E0" w:sz="4"/>
-              <w:bottom w:val="single" w:color="CBD5E0" w:sz="4"/>
-              <w:right w:val="single" w:color="CBD5E0" w:sz="4"/>
-            </w:tcBorders>
-            <w:vAlign w:val="top"/>
-          </w:tcPr>
-          <w:p>
-            <w:pPr>
-              <w:spacing w:after="60" w:before="60"/>
+            <w:tcW w:type="dxa" w:w="3200"/>
+            <w:tcBorders>
+              <w:top w:val="single" w:color="CBD5E0" w:sz="4"/>
+              <w:left w:val="single" w:color="CBD5E0" w:sz="4"/>
+              <w:bottom w:val="single" w:color="CBD5E0" w:sz="4"/>
+              <w:right w:val="single" w:color="CBD5E0" w:sz="4"/>
+            </w:tcBorders>
+            <w:vAlign w:val="top"/>
+          </w:tcPr>
+          <w:p>
+            <w:pPr>
+              <w:spacing w:after="100" w:before="100"/>
             </w:pPr>
             <w:r>
               <w:rPr>
@@ -3073,53 +3063,53 @@
         </w:tc>
         <w:tc>
           <w:tcPr>
-            <w:tcW w:type="dxa" w:w="3460"/>
-            <w:tcBorders>
-              <w:top w:val="single" w:color="CBD5E0" w:sz="4"/>
-              <w:left w:val="single" w:color="CBD5E0" w:sz="4"/>
-              <w:bottom w:val="single" w:color="CBD5E0" w:sz="4"/>
-              <w:right w:val="single" w:color="CBD5E0" w:sz="4"/>
-            </w:tcBorders>
-            <w:vAlign w:val="top"/>
-          </w:tcPr>
-          <w:p>
-            <w:pPr>
-              <w:spacing w:after="60" w:before="60"/>
-            </w:pPr>
-            <w:r>
-              <w:rPr>
-                <w:rFonts w:ascii="Calibri" w:cs="Calibri" w:eastAsia="Calibri" w:hAnsi="Calibri"/>
-                <w:color w:val="4A5568"/>
-                <w:sz w:val="18"/>
-                <w:szCs w:val="18"/>
-              </w:rPr>
-              <w:t xml:space="preserve">Whether manual enablement is required and who performs it, and any geographic or regulatory restrictions, are not currently captured as structured inputs. A brief note or link to an existing rollout plan would be sufficient.</w:t>
-            </w:r>
-          </w:p>
-        </w:tc>
-        <w:tc>
-          <w:tcPr>
-            <w:tcW w:type="dxa" w:w="4160"/>
-            <w:tcBorders>
-              <w:top w:val="single" w:color="CBD5E0" w:sz="4"/>
-              <w:left w:val="single" w:color="CBD5E0" w:sz="4"/>
-              <w:bottom w:val="single" w:color="CBD5E0" w:sz="4"/>
-              <w:right w:val="single" w:color="CBD5E0" w:sz="4"/>
-            </w:tcBorders>
-            <w:vAlign w:val="top"/>
-          </w:tcPr>
-          <w:p>
-            <w:pPr>
-              <w:spacing w:after="60" w:before="60"/>
-            </w:pPr>
-            <w:r>
-              <w:rPr>
-                <w:rFonts w:ascii="Calibri" w:cs="Calibri" w:eastAsia="Calibri" w:hAnsi="Calibri"/>
-                <w:color w:val="4A5568"/>
-                <w:sz w:val="18"/>
-                <w:szCs w:val="18"/>
-              </w:rPr>
-              <w:t xml:space="preserve">Customer announcements, release notes, and CS communications require accurate rollout details. Geographic restrictions are important for localised launch planning.</w:t>
+            <w:tcW w:type="dxa" w:w="3600"/>
+            <w:tcBorders>
+              <w:top w:val="single" w:color="CBD5E0" w:sz="4"/>
+              <w:left w:val="single" w:color="CBD5E0" w:sz="4"/>
+              <w:bottom w:val="single" w:color="CBD5E0" w:sz="4"/>
+              <w:right w:val="single" w:color="CBD5E0" w:sz="4"/>
+            </w:tcBorders>
+            <w:vAlign w:val="top"/>
+          </w:tcPr>
+          <w:p>
+            <w:pPr>
+              <w:spacing w:after="100" w:before="100"/>
+            </w:pPr>
+            <w:r>
+              <w:rPr>
+                <w:rFonts w:ascii="Calibri" w:cs="Calibri" w:eastAsia="Calibri" w:hAnsi="Calibri"/>
+                <w:color w:val="4A5568"/>
+                <w:sz w:val="18"/>
+                <w:szCs w:val="18"/>
+              </w:rPr>
+              <w:t xml:space="preserve">Whether manual enablement is required and who performs it, and any geographic or regulatory restrictions, are not currently captured by the skill and may already exist in a rollout or launch readiness plan.</w:t>
+            </w:r>
+          </w:p>
+        </w:tc>
+        <w:tc>
+          <w:tcPr>
+            <w:tcW w:type="dxa" w:w="4200"/>
+            <w:tcBorders>
+              <w:top w:val="single" w:color="CBD5E0" w:sz="4"/>
+              <w:left w:val="single" w:color="CBD5E0" w:sz="4"/>
+              <w:bottom w:val="single" w:color="CBD5E0" w:sz="4"/>
+              <w:right w:val="single" w:color="CBD5E0" w:sz="4"/>
+            </w:tcBorders>
+            <w:vAlign w:val="top"/>
+          </w:tcPr>
+          <w:p>
+            <w:pPr>
+              <w:spacing w:after="100" w:before="100"/>
+            </w:pPr>
+            <w:r>
+              <w:rPr>
+                <w:rFonts w:ascii="Calibri" w:cs="Calibri" w:eastAsia="Calibri" w:hAnsi="Calibri"/>
+                <w:color w:val="4A5568"/>
+                <w:sz w:val="18"/>
+                <w:szCs w:val="18"/>
+              </w:rPr>
+              <w:t xml:space="preserve">Customer announcements, release notes, and CS communications require accurate rollout detail. Geographic restrictions are important for localised launch planning.</w:t>
             </w:r>
           </w:p>
         </w:tc>
@@ -3139,7 +3129,7 @@
           </w:tcPr>
           <w:p>
             <w:pPr>
-              <w:spacing w:after="40" w:before="60"/>
+              <w:spacing w:after="40" w:before="100"/>
             </w:pPr>
             <w:r>
               <w:rPr>
@@ -3155,7 +3145,7 @@
           </w:p>
           <w:p>
             <w:pPr>
-              <w:spacing w:after="60" w:before="0"/>
+              <w:spacing w:after="100" w:before="0"/>
             </w:pPr>
             <w:r>
               <w:rPr>
@@ -3172,7 +3162,7 @@
         </w:tc>
         <w:tc>
           <w:tcPr>
-            <w:tcW w:type="dxa" w:w="1200"/>
+            <w:tcW w:type="dxa" w:w="1268"/>
             <w:tcBorders>
               <w:top w:val="single" w:color="CBD5E0" w:sz="4"/>
               <w:left w:val="single" w:color="CBD5E0" w:sz="4"/>
@@ -3184,7 +3174,7 @@
           </w:tcPr>
           <w:p>
             <w:pPr>
-              <w:spacing w:after="60" w:before="60"/>
+              <w:spacing w:after="100" w:before="100"/>
               <w:jc w:val="center"/>
             </w:pPr>
             <w:r>
@@ -3193,27 +3183,27 @@
                 <w:b/>
                 <w:bCs/>
                 <w:color w:val="1E40AF"/>
-                <w:sz w:val="18"/>
-                <w:szCs w:val="18"/>
-              </w:rPr>
-              <w:t xml:space="preserve">Opportunity</w:t>
-            </w:r>
-          </w:p>
-        </w:tc>
-        <w:tc>
-          <w:tcPr>
-            <w:tcW w:type="dxa" w:w="3160"/>
-            <w:tcBorders>
-              <w:top w:val="single" w:color="CBD5E0" w:sz="4"/>
-              <w:left w:val="single" w:color="CBD5E0" w:sz="4"/>
-              <w:bottom w:val="single" w:color="CBD5E0" w:sz="4"/>
-              <w:right w:val="single" w:color="CBD5E0" w:sz="4"/>
-            </w:tcBorders>
-            <w:vAlign w:val="top"/>
-          </w:tcPr>
-          <w:p>
-            <w:pPr>
-              <w:spacing w:after="60" w:before="60"/>
+                <w:sz w:val="17"/>
+                <w:szCs w:val="17"/>
+              </w:rPr>
+              <w:t xml:space="preserve">Not Currently Captured</w:t>
+            </w:r>
+          </w:p>
+        </w:tc>
+        <w:tc>
+          <w:tcPr>
+            <w:tcW w:type="dxa" w:w="3200"/>
+            <w:tcBorders>
+              <w:top w:val="single" w:color="CBD5E0" w:sz="4"/>
+              <w:left w:val="single" w:color="CBD5E0" w:sz="4"/>
+              <w:bottom w:val="single" w:color="CBD5E0" w:sz="4"/>
+              <w:right w:val="single" w:color="CBD5E0" w:sz="4"/>
+            </w:tcBorders>
+            <w:vAlign w:val="top"/>
+          </w:tcPr>
+          <w:p>
+            <w:pPr>
+              <w:spacing w:after="100" w:before="100"/>
             </w:pPr>
             <w:r>
               <w:rPr>
@@ -3228,44 +3218,44 @@
         </w:tc>
         <w:tc>
           <w:tcPr>
-            <w:tcW w:type="dxa" w:w="3460"/>
-            <w:tcBorders>
-              <w:top w:val="single" w:color="CBD5E0" w:sz="4"/>
-              <w:left w:val="single" w:color="CBD5E0" w:sz="4"/>
-              <w:bottom w:val="single" w:color="CBD5E0" w:sz="4"/>
-              <w:right w:val="single" w:color="CBD5E0" w:sz="4"/>
-            </w:tcBorders>
-            <w:vAlign w:val="top"/>
-          </w:tcPr>
-          <w:p>
-            <w:pPr>
-              <w:spacing w:after="60" w:before="60"/>
-            </w:pPr>
-            <w:r>
-              <w:rPr>
-                <w:rFonts w:ascii="Calibri" w:cs="Calibri" w:eastAsia="Calibri" w:hAnsi="Calibri"/>
-                <w:color w:val="4A5568"/>
-                <w:sz w:val="18"/>
-                <w:szCs w:val="18"/>
-              </w:rPr>
-              <w:t xml:space="preserve">Pricing plan inclusion, business model, roadmap scope within pricing, trial inclusion, and upgrade paths are not currently captured. A pointer to where this information lives — rather than authored detail — would be sufficient to address this gap.</w:t>
-            </w:r>
-          </w:p>
-        </w:tc>
-        <w:tc>
-          <w:tcPr>
-            <w:tcW w:type="dxa" w:w="4160"/>
-            <w:tcBorders>
-              <w:top w:val="single" w:color="CBD5E0" w:sz="4"/>
-              <w:left w:val="single" w:color="CBD5E0" w:sz="4"/>
-              <w:bottom w:val="single" w:color="CBD5E0" w:sz="4"/>
-              <w:right w:val="single" w:color="CBD5E0" w:sz="4"/>
-            </w:tcBorders>
-            <w:vAlign w:val="top"/>
-          </w:tcPr>
-          <w:p>
-            <w:pPr>
-              <w:spacing w:after="60" w:before="60"/>
+            <w:tcW w:type="dxa" w:w="3600"/>
+            <w:tcBorders>
+              <w:top w:val="single" w:color="CBD5E0" w:sz="4"/>
+              <w:left w:val="single" w:color="CBD5E0" w:sz="4"/>
+              <w:bottom w:val="single" w:color="CBD5E0" w:sz="4"/>
+              <w:right w:val="single" w:color="CBD5E0" w:sz="4"/>
+            </w:tcBorders>
+            <w:vAlign w:val="top"/>
+          </w:tcPr>
+          <w:p>
+            <w:pPr>
+              <w:spacing w:after="100" w:before="100"/>
+            </w:pPr>
+            <w:r>
+              <w:rPr>
+                <w:rFonts w:ascii="Calibri" w:cs="Calibri" w:eastAsia="Calibri" w:hAnsi="Calibri"/>
+                <w:color w:val="4A5568"/>
+                <w:sz w:val="18"/>
+                <w:szCs w:val="18"/>
+              </w:rPr>
+              <w:t xml:space="preserve">Pricing plan inclusion, business model, roadmap scope within pricing, trial inclusion, and upgrade paths are not currently captured by the skill and may already exist in a pricing document or product brief.</w:t>
+            </w:r>
+          </w:p>
+        </w:tc>
+        <w:tc>
+          <w:tcPr>
+            <w:tcW w:type="dxa" w:w="4200"/>
+            <w:tcBorders>
+              <w:top w:val="single" w:color="CBD5E0" w:sz="4"/>
+              <w:left w:val="single" w:color="CBD5E0" w:sz="4"/>
+              <w:bottom w:val="single" w:color="CBD5E0" w:sz="4"/>
+              <w:right w:val="single" w:color="CBD5E0" w:sz="4"/>
+            </w:tcBorders>
+            <w:vAlign w:val="top"/>
+          </w:tcPr>
+          <w:p>
+            <w:pPr>
+              <w:spacing w:after="100" w:before="100"/>
             </w:pPr>
             <w:r>
               <w:rPr>
@@ -3294,7 +3284,7 @@
           </w:tcPr>
           <w:p>
             <w:pPr>
-              <w:spacing w:after="40" w:before="60"/>
+              <w:spacing w:after="40" w:before="100"/>
             </w:pPr>
             <w:r>
               <w:rPr>
@@ -3310,7 +3300,7 @@
           </w:p>
           <w:p>
             <w:pPr>
-              <w:spacing w:after="60" w:before="0"/>
+              <w:spacing w:after="100" w:before="0"/>
             </w:pPr>
             <w:r>
               <w:rPr>
@@ -3327,7 +3317,7 @@
         </w:tc>
         <w:tc>
           <w:tcPr>
-            <w:tcW w:type="dxa" w:w="1200"/>
+            <w:tcW w:type="dxa" w:w="1268"/>
             <w:tcBorders>
               <w:top w:val="single" w:color="CBD5E0" w:sz="4"/>
               <w:left w:val="single" w:color="CBD5E0" w:sz="4"/>
@@ -3339,7 +3329,7 @@
           </w:tcPr>
           <w:p>
             <w:pPr>
-              <w:spacing w:after="60" w:before="60"/>
+              <w:spacing w:after="100" w:before="100"/>
               <w:jc w:val="center"/>
             </w:pPr>
             <w:r>
@@ -3348,27 +3338,27 @@
                 <w:b/>
                 <w:bCs/>
                 <w:color w:val="1E40AF"/>
-                <w:sz w:val="18"/>
-                <w:szCs w:val="18"/>
-              </w:rPr>
-              <w:t xml:space="preserve">Opportunity</w:t>
-            </w:r>
-          </w:p>
-        </w:tc>
-        <w:tc>
-          <w:tcPr>
-            <w:tcW w:type="dxa" w:w="3160"/>
-            <w:tcBorders>
-              <w:top w:val="single" w:color="CBD5E0" w:sz="4"/>
-              <w:left w:val="single" w:color="CBD5E0" w:sz="4"/>
-              <w:bottom w:val="single" w:color="CBD5E0" w:sz="4"/>
-              <w:right w:val="single" w:color="CBD5E0" w:sz="4"/>
-            </w:tcBorders>
-            <w:vAlign w:val="top"/>
-          </w:tcPr>
-          <w:p>
-            <w:pPr>
-              <w:spacing w:after="60" w:before="60"/>
+                <w:sz w:val="17"/>
+                <w:szCs w:val="17"/>
+              </w:rPr>
+              <w:t xml:space="preserve">Not Currently Captured</w:t>
+            </w:r>
+          </w:p>
+        </w:tc>
+        <w:tc>
+          <w:tcPr>
+            <w:tcW w:type="dxa" w:w="3200"/>
+            <w:tcBorders>
+              <w:top w:val="single" w:color="CBD5E0" w:sz="4"/>
+              <w:left w:val="single" w:color="CBD5E0" w:sz="4"/>
+              <w:bottom w:val="single" w:color="CBD5E0" w:sz="4"/>
+              <w:right w:val="single" w:color="CBD5E0" w:sz="4"/>
+            </w:tcBorders>
+            <w:vAlign w:val="top"/>
+          </w:tcPr>
+          <w:p>
+            <w:pPr>
+              <w:spacing w:after="100" w:before="100"/>
             </w:pPr>
             <w:r>
               <w:rPr>
@@ -3383,44 +3373,44 @@
         </w:tc>
         <w:tc>
           <w:tcPr>
-            <w:tcW w:type="dxa" w:w="3460"/>
-            <w:tcBorders>
-              <w:top w:val="single" w:color="CBD5E0" w:sz="4"/>
-              <w:left w:val="single" w:color="CBD5E0" w:sz="4"/>
-              <w:bottom w:val="single" w:color="CBD5E0" w:sz="4"/>
-              <w:right w:val="single" w:color="CBD5E0" w:sz="4"/>
-            </w:tcBorders>
-            <w:vAlign w:val="top"/>
-          </w:tcPr>
-          <w:p>
-            <w:pPr>
-              <w:spacing w:after="60" w:before="60"/>
-            </w:pPr>
-            <w:r>
-              <w:rPr>
-                <w:rFonts w:ascii="Calibri" w:cs="Calibri" w:eastAsia="Calibri" w:hAnsi="Calibri"/>
-                <w:color w:val="4A5568"/>
-                <w:sz w:val="18"/>
-                <w:szCs w:val="18"/>
-              </w:rPr>
-              <w:t xml:space="preserve">Customer-visible failure scenarios, how failures are detected, and monitoring and escalation ownership are not currently captured. This information may be sourced through the skill or referenced from an existing delivery or engineering document.</w:t>
-            </w:r>
-          </w:p>
-        </w:tc>
-        <w:tc>
-          <w:tcPr>
-            <w:tcW w:type="dxa" w:w="4160"/>
-            <w:tcBorders>
-              <w:top w:val="single" w:color="CBD5E0" w:sz="4"/>
-              <w:left w:val="single" w:color="CBD5E0" w:sz="4"/>
-              <w:bottom w:val="single" w:color="CBD5E0" w:sz="4"/>
-              <w:right w:val="single" w:color="CBD5E0" w:sz="4"/>
-            </w:tcBorders>
-            <w:vAlign w:val="top"/>
-          </w:tcPr>
-          <w:p>
-            <w:pPr>
-              <w:spacing w:after="60" w:before="60"/>
+            <w:tcW w:type="dxa" w:w="3600"/>
+            <w:tcBorders>
+              <w:top w:val="single" w:color="CBD5E0" w:sz="4"/>
+              <w:left w:val="single" w:color="CBD5E0" w:sz="4"/>
+              <w:bottom w:val="single" w:color="CBD5E0" w:sz="4"/>
+              <w:right w:val="single" w:color="CBD5E0" w:sz="4"/>
+            </w:tcBorders>
+            <w:vAlign w:val="top"/>
+          </w:tcPr>
+          <w:p>
+            <w:pPr>
+              <w:spacing w:after="100" w:before="100"/>
+            </w:pPr>
+            <w:r>
+              <w:rPr>
+                <w:rFonts w:ascii="Calibri" w:cs="Calibri" w:eastAsia="Calibri" w:hAnsi="Calibri"/>
+                <w:color w:val="4A5568"/>
+                <w:sz w:val="18"/>
+                <w:szCs w:val="18"/>
+              </w:rPr>
+              <w:t xml:space="preserve">Customer-visible failure scenarios, how failures are detected, and monitoring and escalation ownership are not currently captured by the skill and may already exist in a delivery or engineering document.</w:t>
+            </w:r>
+          </w:p>
+        </w:tc>
+        <w:tc>
+          <w:tcPr>
+            <w:tcW w:type="dxa" w:w="4200"/>
+            <w:tcBorders>
+              <w:top w:val="single" w:color="CBD5E0" w:sz="4"/>
+              <w:left w:val="single" w:color="CBD5E0" w:sz="4"/>
+              <w:bottom w:val="single" w:color="CBD5E0" w:sz="4"/>
+              <w:right w:val="single" w:color="CBD5E0" w:sz="4"/>
+            </w:tcBorders>
+            <w:vAlign w:val="top"/>
+          </w:tcPr>
+          <w:p>
+            <w:pPr>
+              <w:spacing w:after="100" w:before="100"/>
             </w:pPr>
             <w:r>
               <w:rPr>
@@ -3449,7 +3439,7 @@
           </w:tcPr>
           <w:p>
             <w:pPr>
-              <w:spacing w:after="40" w:before="60"/>
+              <w:spacing w:after="40" w:before="100"/>
             </w:pPr>
             <w:r>
               <w:rPr>
@@ -3465,7 +3455,7 @@
           </w:p>
           <w:p>
             <w:pPr>
-              <w:spacing w:after="60" w:before="0"/>
+              <w:spacing w:after="100" w:before="0"/>
             </w:pPr>
             <w:r>
               <w:rPr>
@@ -3482,7 +3472,7 @@
         </w:tc>
         <w:tc>
           <w:tcPr>
-            <w:tcW w:type="dxa" w:w="1200"/>
+            <w:tcW w:type="dxa" w:w="1268"/>
             <w:tcBorders>
               <w:top w:val="single" w:color="CBD5E0" w:sz="4"/>
               <w:left w:val="single" w:color="CBD5E0" w:sz="4"/>
@@ -3494,7 +3484,7 @@
           </w:tcPr>
           <w:p>
             <w:pPr>
-              <w:spacing w:after="60" w:before="60"/>
+              <w:spacing w:after="100" w:before="100"/>
               <w:jc w:val="center"/>
             </w:pPr>
             <w:r>
@@ -3503,27 +3493,27 @@
                 <w:b/>
                 <w:bCs/>
                 <w:color w:val="1E40AF"/>
-                <w:sz w:val="18"/>
-                <w:szCs w:val="18"/>
-              </w:rPr>
-              <w:t xml:space="preserve">Opportunity</w:t>
-            </w:r>
-          </w:p>
-        </w:tc>
-        <w:tc>
-          <w:tcPr>
-            <w:tcW w:type="dxa" w:w="3160"/>
-            <w:tcBorders>
-              <w:top w:val="single" w:color="CBD5E0" w:sz="4"/>
-              <w:left w:val="single" w:color="CBD5E0" w:sz="4"/>
-              <w:bottom w:val="single" w:color="CBD5E0" w:sz="4"/>
-              <w:right w:val="single" w:color="CBD5E0" w:sz="4"/>
-            </w:tcBorders>
-            <w:vAlign w:val="top"/>
-          </w:tcPr>
-          <w:p>
-            <w:pPr>
-              <w:spacing w:after="60" w:before="60"/>
+                <w:sz w:val="17"/>
+                <w:szCs w:val="17"/>
+              </w:rPr>
+              <w:t xml:space="preserve">Not Currently Captured</w:t>
+            </w:r>
+          </w:p>
+        </w:tc>
+        <w:tc>
+          <w:tcPr>
+            <w:tcW w:type="dxa" w:w="3200"/>
+            <w:tcBorders>
+              <w:top w:val="single" w:color="CBD5E0" w:sz="4"/>
+              <w:left w:val="single" w:color="CBD5E0" w:sz="4"/>
+              <w:bottom w:val="single" w:color="CBD5E0" w:sz="4"/>
+              <w:right w:val="single" w:color="CBD5E0" w:sz="4"/>
+            </w:tcBorders>
+            <w:vAlign w:val="top"/>
+          </w:tcPr>
+          <w:p>
+            <w:pPr>
+              <w:spacing w:after="100" w:before="100"/>
             </w:pPr>
             <w:r>
               <w:rPr>
@@ -3538,44 +3528,44 @@
         </w:tc>
         <w:tc>
           <w:tcPr>
-            <w:tcW w:type="dxa" w:w="3460"/>
-            <w:tcBorders>
-              <w:top w:val="single" w:color="CBD5E0" w:sz="4"/>
-              <w:left w:val="single" w:color="CBD5E0" w:sz="4"/>
-              <w:bottom w:val="single" w:color="CBD5E0" w:sz="4"/>
-              <w:right w:val="single" w:color="CBD5E0" w:sz="4"/>
-            </w:tcBorders>
-            <w:vAlign w:val="top"/>
-          </w:tcPr>
-          <w:p>
-            <w:pPr>
-              <w:spacing w:after="60" w:before="60"/>
-            </w:pPr>
-            <w:r>
-              <w:rPr>
-                <w:rFonts w:ascii="Calibri" w:cs="Calibri" w:eastAsia="Calibri" w:hAnsi="Calibri"/>
-                <w:color w:val="4A5568"/>
-                <w:sz w:val="18"/>
-                <w:szCs w:val="18"/>
-              </w:rPr>
-              <w:t xml:space="preserve">The error message a user sees when the feature fails, whether the error is self-service or requires support, the recovery path, and the customer reporting channel are not currently captured. This may be referenced from existing engineering documentation.</w:t>
-            </w:r>
-          </w:p>
-        </w:tc>
-        <w:tc>
-          <w:tcPr>
-            <w:tcW w:type="dxa" w:w="4160"/>
-            <w:tcBorders>
-              <w:top w:val="single" w:color="CBD5E0" w:sz="4"/>
-              <w:left w:val="single" w:color="CBD5E0" w:sz="4"/>
-              <w:bottom w:val="single" w:color="CBD5E0" w:sz="4"/>
-              <w:right w:val="single" w:color="CBD5E0" w:sz="4"/>
-            </w:tcBorders>
-            <w:vAlign w:val="top"/>
-          </w:tcPr>
-          <w:p>
-            <w:pPr>
-              <w:spacing w:after="60" w:before="60"/>
+            <w:tcW w:type="dxa" w:w="3600"/>
+            <w:tcBorders>
+              <w:top w:val="single" w:color="CBD5E0" w:sz="4"/>
+              <w:left w:val="single" w:color="CBD5E0" w:sz="4"/>
+              <w:bottom w:val="single" w:color="CBD5E0" w:sz="4"/>
+              <w:right w:val="single" w:color="CBD5E0" w:sz="4"/>
+            </w:tcBorders>
+            <w:vAlign w:val="top"/>
+          </w:tcPr>
+          <w:p>
+            <w:pPr>
+              <w:spacing w:after="100" w:before="100"/>
+            </w:pPr>
+            <w:r>
+              <w:rPr>
+                <w:rFonts w:ascii="Calibri" w:cs="Calibri" w:eastAsia="Calibri" w:hAnsi="Calibri"/>
+                <w:color w:val="4A5568"/>
+                <w:sz w:val="18"/>
+                <w:szCs w:val="18"/>
+              </w:rPr>
+              <w:t xml:space="preserve">The error message a user sees when the feature fails, whether the error is self-service or requires support, the recovery path, and the customer reporting channel are not currently captured by the skill and may already exist in engineering documentation.</w:t>
+            </w:r>
+          </w:p>
+        </w:tc>
+        <w:tc>
+          <w:tcPr>
+            <w:tcW w:type="dxa" w:w="4200"/>
+            <w:tcBorders>
+              <w:top w:val="single" w:color="CBD5E0" w:sz="4"/>
+              <w:left w:val="single" w:color="CBD5E0" w:sz="4"/>
+              <w:bottom w:val="single" w:color="CBD5E0" w:sz="4"/>
+              <w:right w:val="single" w:color="CBD5E0" w:sz="4"/>
+            </w:tcBorders>
+            <w:vAlign w:val="top"/>
+          </w:tcPr>
+          <w:p>
+            <w:pPr>
+              <w:spacing w:after="100" w:before="100"/>
             </w:pPr>
             <w:r>
               <w:rPr>
@@ -3604,7 +3594,7 @@
           </w:tcPr>
           <w:p>
             <w:pPr>
-              <w:spacing w:after="40" w:before="60"/>
+              <w:spacing w:after="40" w:before="100"/>
             </w:pPr>
             <w:r>
               <w:rPr>
@@ -3620,7 +3610,7 @@
           </w:p>
           <w:p>
             <w:pPr>
-              <w:spacing w:after="60" w:before="0"/>
+              <w:spacing w:after="100" w:before="0"/>
             </w:pPr>
             <w:r>
               <w:rPr>
@@ -3637,7 +3627,7 @@
         </w:tc>
         <w:tc>
           <w:tcPr>
-            <w:tcW w:type="dxa" w:w="1200"/>
+            <w:tcW w:type="dxa" w:w="1268"/>
             <w:tcBorders>
               <w:top w:val="single" w:color="CBD5E0" w:sz="4"/>
               <w:left w:val="single" w:color="CBD5E0" w:sz="4"/>
@@ -3649,7 +3639,7 @@
           </w:tcPr>
           <w:p>
             <w:pPr>
-              <w:spacing w:after="60" w:before="60"/>
+              <w:spacing w:after="100" w:before="100"/>
               <w:jc w:val="center"/>
             </w:pPr>
             <w:r>
@@ -3658,27 +3648,27 @@
                 <w:b/>
                 <w:bCs/>
                 <w:color w:val="1E40AF"/>
-                <w:sz w:val="18"/>
-                <w:szCs w:val="18"/>
-              </w:rPr>
-              <w:t xml:space="preserve">Opportunity</w:t>
-            </w:r>
-          </w:p>
-        </w:tc>
-        <w:tc>
-          <w:tcPr>
-            <w:tcW w:type="dxa" w:w="3160"/>
-            <w:tcBorders>
-              <w:top w:val="single" w:color="CBD5E0" w:sz="4"/>
-              <w:left w:val="single" w:color="CBD5E0" w:sz="4"/>
-              <w:bottom w:val="single" w:color="CBD5E0" w:sz="4"/>
-              <w:right w:val="single" w:color="CBD5E0" w:sz="4"/>
-            </w:tcBorders>
-            <w:vAlign w:val="top"/>
-          </w:tcPr>
-          <w:p>
-            <w:pPr>
-              <w:spacing w:after="60" w:before="60"/>
+                <w:sz w:val="17"/>
+                <w:szCs w:val="17"/>
+              </w:rPr>
+              <w:t xml:space="preserve">Not Currently Captured</w:t>
+            </w:r>
+          </w:p>
+        </w:tc>
+        <w:tc>
+          <w:tcPr>
+            <w:tcW w:type="dxa" w:w="3200"/>
+            <w:tcBorders>
+              <w:top w:val="single" w:color="CBD5E0" w:sz="4"/>
+              <w:left w:val="single" w:color="CBD5E0" w:sz="4"/>
+              <w:bottom w:val="single" w:color="CBD5E0" w:sz="4"/>
+              <w:right w:val="single" w:color="CBD5E0" w:sz="4"/>
+            </w:tcBorders>
+            <w:vAlign w:val="top"/>
+          </w:tcPr>
+          <w:p>
+            <w:pPr>
+              <w:spacing w:after="100" w:before="100"/>
             </w:pPr>
             <w:r>
               <w:rPr>
@@ -3693,44 +3683,44 @@
         </w:tc>
         <w:tc>
           <w:tcPr>
-            <w:tcW w:type="dxa" w:w="3460"/>
-            <w:tcBorders>
-              <w:top w:val="single" w:color="CBD5E0" w:sz="4"/>
-              <w:left w:val="single" w:color="CBD5E0" w:sz="4"/>
-              <w:bottom w:val="single" w:color="CBD5E0" w:sz="4"/>
-              <w:right w:val="single" w:color="CBD5E0" w:sz="4"/>
-            </w:tcBorders>
-            <w:vAlign w:val="top"/>
-          </w:tcPr>
-          <w:p>
-            <w:pPr>
-              <w:spacing w:after="60" w:before="60"/>
-            </w:pPr>
-            <w:r>
-              <w:rPr>
-                <w:rFonts w:ascii="Calibri" w:cs="Calibri" w:eastAsia="Calibri" w:hAnsi="Calibri"/>
-                <w:color w:val="4A5568"/>
-                <w:sz w:val="18"/>
-                <w:szCs w:val="18"/>
-              </w:rPr>
-              <w:t xml:space="preserve">The customer issue reporting process, minimum information needed for a bug report, and the on-call contact for the launch period are not currently captured. A brief reference to an existing escalation runbook would address this.</w:t>
-            </w:r>
-          </w:p>
-        </w:tc>
-        <w:tc>
-          <w:tcPr>
-            <w:tcW w:type="dxa" w:w="4160"/>
-            <w:tcBorders>
-              <w:top w:val="single" w:color="CBD5E0" w:sz="4"/>
-              <w:left w:val="single" w:color="CBD5E0" w:sz="4"/>
-              <w:bottom w:val="single" w:color="CBD5E0" w:sz="4"/>
-              <w:right w:val="single" w:color="CBD5E0" w:sz="4"/>
-            </w:tcBorders>
-            <w:vAlign w:val="top"/>
-          </w:tcPr>
-          <w:p>
-            <w:pPr>
-              <w:spacing w:after="60" w:before="60"/>
+            <w:tcW w:type="dxa" w:w="3600"/>
+            <w:tcBorders>
+              <w:top w:val="single" w:color="CBD5E0" w:sz="4"/>
+              <w:left w:val="single" w:color="CBD5E0" w:sz="4"/>
+              <w:bottom w:val="single" w:color="CBD5E0" w:sz="4"/>
+              <w:right w:val="single" w:color="CBD5E0" w:sz="4"/>
+            </w:tcBorders>
+            <w:vAlign w:val="top"/>
+          </w:tcPr>
+          <w:p>
+            <w:pPr>
+              <w:spacing w:after="100" w:before="100"/>
+            </w:pPr>
+            <w:r>
+              <w:rPr>
+                <w:rFonts w:ascii="Calibri" w:cs="Calibri" w:eastAsia="Calibri" w:hAnsi="Calibri"/>
+                <w:color w:val="4A5568"/>
+                <w:sz w:val="18"/>
+                <w:szCs w:val="18"/>
+              </w:rPr>
+              <w:t xml:space="preserve">The customer issue reporting process, minimum information needed for a bug report, and the on-call contact for the launch period are not currently captured by the skill and may already exist in an escalation runbook.</w:t>
+            </w:r>
+          </w:p>
+        </w:tc>
+        <w:tc>
+          <w:tcPr>
+            <w:tcW w:type="dxa" w:w="4200"/>
+            <w:tcBorders>
+              <w:top w:val="single" w:color="CBD5E0" w:sz="4"/>
+              <w:left w:val="single" w:color="CBD5E0" w:sz="4"/>
+              <w:bottom w:val="single" w:color="CBD5E0" w:sz="4"/>
+              <w:right w:val="single" w:color="CBD5E0" w:sz="4"/>
+            </w:tcBorders>
+            <w:vAlign w:val="top"/>
+          </w:tcPr>
+          <w:p>
+            <w:pPr>
+              <w:spacing w:after="100" w:before="100"/>
             </w:pPr>
             <w:r>
               <w:rPr>
@@ -3758,7 +3748,7 @@
           </w:tcPr>
           <w:p>
             <w:pPr>
-              <w:spacing w:after="60" w:before="60"/>
+              <w:spacing w:after="100" w:before="100"/>
             </w:pPr>
             <w:r>
               <w:rPr>
@@ -3789,7 +3779,7 @@
           </w:tcPr>
           <w:p>
             <w:pPr>
-              <w:spacing w:after="40" w:before="60"/>
+              <w:spacing w:after="40" w:before="100"/>
             </w:pPr>
             <w:r>
               <w:rPr>
@@ -3805,7 +3795,7 @@
           </w:p>
           <w:p>
             <w:pPr>
-              <w:spacing w:after="60" w:before="0"/>
+              <w:spacing w:after="100" w:before="0"/>
             </w:pPr>
             <w:r>
               <w:rPr>
@@ -3822,7 +3812,7 @@
         </w:tc>
         <w:tc>
           <w:tcPr>
-            <w:tcW w:type="dxa" w:w="1200"/>
+            <w:tcW w:type="dxa" w:w="1268"/>
             <w:tcBorders>
               <w:top w:val="single" w:color="CBD5E0" w:sz="4"/>
               <w:left w:val="single" w:color="CBD5E0" w:sz="4"/>
@@ -3834,7 +3824,7 @@
           </w:tcPr>
           <w:p>
             <w:pPr>
-              <w:spacing w:after="60" w:before="60"/>
+              <w:spacing w:after="100" w:before="100"/>
               <w:jc w:val="center"/>
             </w:pPr>
             <w:r>
@@ -3843,27 +3833,27 @@
                 <w:b/>
                 <w:bCs/>
                 <w:color w:val="1E40AF"/>
-                <w:sz w:val="18"/>
-                <w:szCs w:val="18"/>
-              </w:rPr>
-              <w:t xml:space="preserve">Opportunity</w:t>
-            </w:r>
-          </w:p>
-        </w:tc>
-        <w:tc>
-          <w:tcPr>
-            <w:tcW w:type="dxa" w:w="3160"/>
-            <w:tcBorders>
-              <w:top w:val="single" w:color="CBD5E0" w:sz="4"/>
-              <w:left w:val="single" w:color="CBD5E0" w:sz="4"/>
-              <w:bottom w:val="single" w:color="CBD5E0" w:sz="4"/>
-              <w:right w:val="single" w:color="CBD5E0" w:sz="4"/>
-            </w:tcBorders>
-            <w:vAlign w:val="top"/>
-          </w:tcPr>
-          <w:p>
-            <w:pPr>
-              <w:spacing w:after="60" w:before="60"/>
+                <w:sz w:val="17"/>
+                <w:szCs w:val="17"/>
+              </w:rPr>
+              <w:t xml:space="preserve">Not Currently Captured</w:t>
+            </w:r>
+          </w:p>
+        </w:tc>
+        <w:tc>
+          <w:tcPr>
+            <w:tcW w:type="dxa" w:w="3200"/>
+            <w:tcBorders>
+              <w:top w:val="single" w:color="CBD5E0" w:sz="4"/>
+              <w:left w:val="single" w:color="CBD5E0" w:sz="4"/>
+              <w:bottom w:val="single" w:color="CBD5E0" w:sz="4"/>
+              <w:right w:val="single" w:color="CBD5E0" w:sz="4"/>
+            </w:tcBorders>
+            <w:vAlign w:val="top"/>
+          </w:tcPr>
+          <w:p>
+            <w:pPr>
+              <w:spacing w:after="100" w:before="100"/>
             </w:pPr>
             <w:r>
               <w:rPr>
@@ -3878,44 +3868,44 @@
         </w:tc>
         <w:tc>
           <w:tcPr>
-            <w:tcW w:type="dxa" w:w="3460"/>
-            <w:tcBorders>
-              <w:top w:val="single" w:color="CBD5E0" w:sz="4"/>
-              <w:left w:val="single" w:color="CBD5E0" w:sz="4"/>
-              <w:bottom w:val="single" w:color="CBD5E0" w:sz="4"/>
-              <w:right w:val="single" w:color="CBD5E0" w:sz="4"/>
-            </w:tcBorders>
-            <w:vAlign w:val="top"/>
-          </w:tcPr>
-          <w:p>
-            <w:pPr>
-              <w:spacing w:after="60" w:before="60"/>
-            </w:pPr>
-            <w:r>
-              <w:rPr>
-                <w:rFonts w:ascii="Calibri" w:cs="Calibri" w:eastAsia="Calibri" w:hAnsi="Calibri"/>
-                <w:color w:val="4A5568"/>
-                <w:sz w:val="18"/>
-                <w:szCs w:val="18"/>
-              </w:rPr>
-              <w:t xml:space="preserve">Whether production screenshots or demo environment access is available, whether a walkthrough recording exists, and which UI areas are embargoed are not currently captured. A brief status note or link to existing assets would be sufficient.</w:t>
-            </w:r>
-          </w:p>
-        </w:tc>
-        <w:tc>
-          <w:tcPr>
-            <w:tcW w:type="dxa" w:w="4160"/>
-            <w:tcBorders>
-              <w:top w:val="single" w:color="CBD5E0" w:sz="4"/>
-              <w:left w:val="single" w:color="CBD5E0" w:sz="4"/>
-              <w:bottom w:val="single" w:color="CBD5E0" w:sz="4"/>
-              <w:right w:val="single" w:color="CBD5E0" w:sz="4"/>
-            </w:tcBorders>
-            <w:vAlign w:val="top"/>
-          </w:tcPr>
-          <w:p>
-            <w:pPr>
-              <w:spacing w:after="60" w:before="60"/>
+            <w:tcW w:type="dxa" w:w="3600"/>
+            <w:tcBorders>
+              <w:top w:val="single" w:color="CBD5E0" w:sz="4"/>
+              <w:left w:val="single" w:color="CBD5E0" w:sz="4"/>
+              <w:bottom w:val="single" w:color="CBD5E0" w:sz="4"/>
+              <w:right w:val="single" w:color="CBD5E0" w:sz="4"/>
+            </w:tcBorders>
+            <w:vAlign w:val="top"/>
+          </w:tcPr>
+          <w:p>
+            <w:pPr>
+              <w:spacing w:after="100" w:before="100"/>
+            </w:pPr>
+            <w:r>
+              <w:rPr>
+                <w:rFonts w:ascii="Calibri" w:cs="Calibri" w:eastAsia="Calibri" w:hAnsi="Calibri"/>
+                <w:color w:val="4A5568"/>
+                <w:sz w:val="18"/>
+                <w:szCs w:val="18"/>
+              </w:rPr>
+              <w:t xml:space="preserve">Whether production screenshots or demo environment access is available, whether a walkthrough recording exists, and which UI areas are embargoed are not currently captured by the skill and may already exist as assets in another location.</w:t>
+            </w:r>
+          </w:p>
+        </w:tc>
+        <w:tc>
+          <w:tcPr>
+            <w:tcW w:type="dxa" w:w="4200"/>
+            <w:tcBorders>
+              <w:top w:val="single" w:color="CBD5E0" w:sz="4"/>
+              <w:left w:val="single" w:color="CBD5E0" w:sz="4"/>
+              <w:bottom w:val="single" w:color="CBD5E0" w:sz="4"/>
+              <w:right w:val="single" w:color="CBD5E0" w:sz="4"/>
+            </w:tcBorders>
+            <w:vAlign w:val="top"/>
+          </w:tcPr>
+          <w:p>
+            <w:pPr>
+              <w:spacing w:after="100" w:before="100"/>
             </w:pPr>
             <w:r>
               <w:rPr>
@@ -3944,7 +3934,7 @@
           </w:tcPr>
           <w:p>
             <w:pPr>
-              <w:spacing w:after="40" w:before="60"/>
+              <w:spacing w:after="40" w:before="100"/>
             </w:pPr>
             <w:r>
               <w:rPr>
@@ -3960,7 +3950,7 @@
           </w:p>
           <w:p>
             <w:pPr>
-              <w:spacing w:after="60" w:before="0"/>
+              <w:spacing w:after="100" w:before="0"/>
             </w:pPr>
             <w:r>
               <w:rPr>
@@ -3977,7 +3967,7 @@
         </w:tc>
         <w:tc>
           <w:tcPr>
-            <w:tcW w:type="dxa" w:w="1200"/>
+            <w:tcW w:type="dxa" w:w="1268"/>
             <w:tcBorders>
               <w:top w:val="single" w:color="CBD5E0" w:sz="4"/>
               <w:left w:val="single" w:color="CBD5E0" w:sz="4"/>
@@ -3989,7 +3979,7 @@
           </w:tcPr>
           <w:p>
             <w:pPr>
-              <w:spacing w:after="60" w:before="60"/>
+              <w:spacing w:after="100" w:before="100"/>
               <w:jc w:val="center"/>
             </w:pPr>
             <w:r>
@@ -3998,27 +3988,27 @@
                 <w:b/>
                 <w:bCs/>
                 <w:color w:val="1E40AF"/>
-                <w:sz w:val="18"/>
-                <w:szCs w:val="18"/>
-              </w:rPr>
-              <w:t xml:space="preserve">Opportunity</w:t>
-            </w:r>
-          </w:p>
-        </w:tc>
-        <w:tc>
-          <w:tcPr>
-            <w:tcW w:type="dxa" w:w="3160"/>
-            <w:tcBorders>
-              <w:top w:val="single" w:color="CBD5E0" w:sz="4"/>
-              <w:left w:val="single" w:color="CBD5E0" w:sz="4"/>
-              <w:bottom w:val="single" w:color="CBD5E0" w:sz="4"/>
-              <w:right w:val="single" w:color="CBD5E0" w:sz="4"/>
-            </w:tcBorders>
-            <w:vAlign w:val="top"/>
-          </w:tcPr>
-          <w:p>
-            <w:pPr>
-              <w:spacing w:after="60" w:before="60"/>
+                <w:sz w:val="17"/>
+                <w:szCs w:val="17"/>
+              </w:rPr>
+              <w:t xml:space="preserve">Not Currently Captured</w:t>
+            </w:r>
+          </w:p>
+        </w:tc>
+        <w:tc>
+          <w:tcPr>
+            <w:tcW w:type="dxa" w:w="3200"/>
+            <w:tcBorders>
+              <w:top w:val="single" w:color="CBD5E0" w:sz="4"/>
+              <w:left w:val="single" w:color="CBD5E0" w:sz="4"/>
+              <w:bottom w:val="single" w:color="CBD5E0" w:sz="4"/>
+              <w:right w:val="single" w:color="CBD5E0" w:sz="4"/>
+            </w:tcBorders>
+            <w:vAlign w:val="top"/>
+          </w:tcPr>
+          <w:p>
+            <w:pPr>
+              <w:spacing w:after="100" w:before="100"/>
             </w:pPr>
             <w:r>
               <w:rPr>
@@ -4033,44 +4023,44 @@
         </w:tc>
         <w:tc>
           <w:tcPr>
-            <w:tcW w:type="dxa" w:w="3460"/>
-            <w:tcBorders>
-              <w:top w:val="single" w:color="CBD5E0" w:sz="4"/>
-              <w:left w:val="single" w:color="CBD5E0" w:sz="4"/>
-              <w:bottom w:val="single" w:color="CBD5E0" w:sz="4"/>
-              <w:right w:val="single" w:color="CBD5E0" w:sz="4"/>
-            </w:tcBorders>
-            <w:vAlign w:val="top"/>
-          </w:tcPr>
-          <w:p>
-            <w:pPr>
-              <w:spacing w:after="60" w:before="60"/>
-            </w:pPr>
-            <w:r>
-              <w:rPr>
-                <w:rFonts w:ascii="Calibri" w:cs="Calibri" w:eastAsia="Calibri" w:hAnsi="Calibri"/>
-                <w:color w:val="4A5568"/>
-                <w:sz w:val="18"/>
-                <w:szCs w:val="18"/>
-              </w:rPr>
-              <w:t xml:space="preserve">Whether a sandbox or demo environment exists, what configuration is needed to demo the feature, and how Sales Engineering requests access are not currently captured. A pointer to existing SE documentation would address this.</w:t>
-            </w:r>
-          </w:p>
-        </w:tc>
-        <w:tc>
-          <w:tcPr>
-            <w:tcW w:type="dxa" w:w="4160"/>
-            <w:tcBorders>
-              <w:top w:val="single" w:color="CBD5E0" w:sz="4"/>
-              <w:left w:val="single" w:color="CBD5E0" w:sz="4"/>
-              <w:bottom w:val="single" w:color="CBD5E0" w:sz="4"/>
-              <w:right w:val="single" w:color="CBD5E0" w:sz="4"/>
-            </w:tcBorders>
-            <w:vAlign w:val="top"/>
-          </w:tcPr>
-          <w:p>
-            <w:pPr>
-              <w:spacing w:after="60" w:before="60"/>
+            <w:tcW w:type="dxa" w:w="3600"/>
+            <w:tcBorders>
+              <w:top w:val="single" w:color="CBD5E0" w:sz="4"/>
+              <w:left w:val="single" w:color="CBD5E0" w:sz="4"/>
+              <w:bottom w:val="single" w:color="CBD5E0" w:sz="4"/>
+              <w:right w:val="single" w:color="CBD5E0" w:sz="4"/>
+            </w:tcBorders>
+            <w:vAlign w:val="top"/>
+          </w:tcPr>
+          <w:p>
+            <w:pPr>
+              <w:spacing w:after="100" w:before="100"/>
+            </w:pPr>
+            <w:r>
+              <w:rPr>
+                <w:rFonts w:ascii="Calibri" w:cs="Calibri" w:eastAsia="Calibri" w:hAnsi="Calibri"/>
+                <w:color w:val="4A5568"/>
+                <w:sz w:val="18"/>
+                <w:szCs w:val="18"/>
+              </w:rPr>
+              <w:t xml:space="preserve">Whether a sandbox or demo environment exists, what configuration is needed to demo the feature, and how Sales Engineering requests access are not currently captured by the skill and may already exist in SE documentation.</w:t>
+            </w:r>
+          </w:p>
+        </w:tc>
+        <w:tc>
+          <w:tcPr>
+            <w:tcW w:type="dxa" w:w="4200"/>
+            <w:tcBorders>
+              <w:top w:val="single" w:color="CBD5E0" w:sz="4"/>
+              <w:left w:val="single" w:color="CBD5E0" w:sz="4"/>
+              <w:bottom w:val="single" w:color="CBD5E0" w:sz="4"/>
+              <w:right w:val="single" w:color="CBD5E0" w:sz="4"/>
+            </w:tcBorders>
+            <w:vAlign w:val="top"/>
+          </w:tcPr>
+          <w:p>
+            <w:pPr>
+              <w:spacing w:after="100" w:before="100"/>
             </w:pPr>
             <w:r>
               <w:rPr>
@@ -4099,7 +4089,7 @@
           </w:tcPr>
           <w:p>
             <w:pPr>
-              <w:spacing w:after="40" w:before="60"/>
+              <w:spacing w:after="40" w:before="100"/>
             </w:pPr>
             <w:r>
               <w:rPr>
@@ -4115,7 +4105,7 @@
           </w:p>
           <w:p>
             <w:pPr>
-              <w:spacing w:after="60" w:before="0"/>
+              <w:spacing w:after="100" w:before="0"/>
             </w:pPr>
             <w:r>
               <w:rPr>
@@ -4132,7 +4122,7 @@
         </w:tc>
         <w:tc>
           <w:tcPr>
-            <w:tcW w:type="dxa" w:w="1200"/>
+            <w:tcW w:type="dxa" w:w="1268"/>
             <w:tcBorders>
               <w:top w:val="single" w:color="CBD5E0" w:sz="4"/>
               <w:left w:val="single" w:color="CBD5E0" w:sz="4"/>
@@ -4144,7 +4134,7 @@
           </w:tcPr>
           <w:p>
             <w:pPr>
-              <w:spacing w:after="60" w:before="60"/>
+              <w:spacing w:after="100" w:before="100"/>
               <w:jc w:val="center"/>
             </w:pPr>
             <w:r>
@@ -4153,27 +4143,27 @@
                 <w:b/>
                 <w:bCs/>
                 <w:color w:val="1E40AF"/>
-                <w:sz w:val="18"/>
-                <w:szCs w:val="18"/>
-              </w:rPr>
-              <w:t xml:space="preserve">Opportunity</w:t>
-            </w:r>
-          </w:p>
-        </w:tc>
-        <w:tc>
-          <w:tcPr>
-            <w:tcW w:type="dxa" w:w="3160"/>
-            <w:tcBorders>
-              <w:top w:val="single" w:color="CBD5E0" w:sz="4"/>
-              <w:left w:val="single" w:color="CBD5E0" w:sz="4"/>
-              <w:bottom w:val="single" w:color="CBD5E0" w:sz="4"/>
-              <w:right w:val="single" w:color="CBD5E0" w:sz="4"/>
-            </w:tcBorders>
-            <w:vAlign w:val="top"/>
-          </w:tcPr>
-          <w:p>
-            <w:pPr>
-              <w:spacing w:after="60" w:before="60"/>
+                <w:sz w:val="17"/>
+                <w:szCs w:val="17"/>
+              </w:rPr>
+              <w:t xml:space="preserve">Not Currently Captured</w:t>
+            </w:r>
+          </w:p>
+        </w:tc>
+        <w:tc>
+          <w:tcPr>
+            <w:tcW w:type="dxa" w:w="3200"/>
+            <w:tcBorders>
+              <w:top w:val="single" w:color="CBD5E0" w:sz="4"/>
+              <w:left w:val="single" w:color="CBD5E0" w:sz="4"/>
+              <w:bottom w:val="single" w:color="CBD5E0" w:sz="4"/>
+              <w:right w:val="single" w:color="CBD5E0" w:sz="4"/>
+            </w:tcBorders>
+            <w:vAlign w:val="top"/>
+          </w:tcPr>
+          <w:p>
+            <w:pPr>
+              <w:spacing w:after="100" w:before="100"/>
             </w:pPr>
             <w:r>
               <w:rPr>
@@ -4188,44 +4178,44 @@
         </w:tc>
         <w:tc>
           <w:tcPr>
-            <w:tcW w:type="dxa" w:w="3460"/>
-            <w:tcBorders>
-              <w:top w:val="single" w:color="CBD5E0" w:sz="4"/>
-              <w:left w:val="single" w:color="CBD5E0" w:sz="4"/>
-              <w:bottom w:val="single" w:color="CBD5E0" w:sz="4"/>
-              <w:right w:val="single" w:color="CBD5E0" w:sz="4"/>
-            </w:tcBorders>
-            <w:vAlign w:val="top"/>
-          </w:tcPr>
-          <w:p>
-            <w:pPr>
-              <w:spacing w:after="60" w:before="60"/>
-            </w:pPr>
-            <w:r>
-              <w:rPr>
-                <w:rFonts w:ascii="Calibri" w:cs="Calibri" w:eastAsia="Calibri" w:hAnsi="Calibri"/>
-                <w:color w:val="4A5568"/>
-                <w:sz w:val="18"/>
-                <w:szCs w:val="18"/>
-              </w:rPr>
-              <w:t xml:space="preserve">Whether a help article is published at launch — or the target publication date — and confirmation of its coverage of the end-to-end workflow are not currently captured. A single-line status note would suffice.</w:t>
-            </w:r>
-          </w:p>
-        </w:tc>
-        <w:tc>
-          <w:tcPr>
-            <w:tcW w:type="dxa" w:w="4160"/>
-            <w:tcBorders>
-              <w:top w:val="single" w:color="CBD5E0" w:sz="4"/>
-              <w:left w:val="single" w:color="CBD5E0" w:sz="4"/>
-              <w:bottom w:val="single" w:color="CBD5E0" w:sz="4"/>
-              <w:right w:val="single" w:color="CBD5E0" w:sz="4"/>
-            </w:tcBorders>
-            <w:vAlign w:val="top"/>
-          </w:tcPr>
-          <w:p>
-            <w:pPr>
-              <w:spacing w:after="60" w:before="60"/>
+            <w:tcW w:type="dxa" w:w="3600"/>
+            <w:tcBorders>
+              <w:top w:val="single" w:color="CBD5E0" w:sz="4"/>
+              <w:left w:val="single" w:color="CBD5E0" w:sz="4"/>
+              <w:bottom w:val="single" w:color="CBD5E0" w:sz="4"/>
+              <w:right w:val="single" w:color="CBD5E0" w:sz="4"/>
+            </w:tcBorders>
+            <w:vAlign w:val="top"/>
+          </w:tcPr>
+          <w:p>
+            <w:pPr>
+              <w:spacing w:after="100" w:before="100"/>
+            </w:pPr>
+            <w:r>
+              <w:rPr>
+                <w:rFonts w:ascii="Calibri" w:cs="Calibri" w:eastAsia="Calibri" w:hAnsi="Calibri"/>
+                <w:color w:val="4A5568"/>
+                <w:sz w:val="18"/>
+                <w:szCs w:val="18"/>
+              </w:rPr>
+              <w:t xml:space="preserve">Whether a help article is published at launch — or the target publication date — is not currently captured by the skill and may already exist in a documentation plan or content calendar.</w:t>
+            </w:r>
+          </w:p>
+        </w:tc>
+        <w:tc>
+          <w:tcPr>
+            <w:tcW w:type="dxa" w:w="4200"/>
+            <w:tcBorders>
+              <w:top w:val="single" w:color="CBD5E0" w:sz="4"/>
+              <w:left w:val="single" w:color="CBD5E0" w:sz="4"/>
+              <w:bottom w:val="single" w:color="CBD5E0" w:sz="4"/>
+              <w:right w:val="single" w:color="CBD5E0" w:sz="4"/>
+            </w:tcBorders>
+            <w:vAlign w:val="top"/>
+          </w:tcPr>
+          <w:p>
+            <w:pPr>
+              <w:spacing w:after="100" w:before="100"/>
             </w:pPr>
             <w:r>
               <w:rPr>
@@ -4254,7 +4244,7 @@
           </w:tcPr>
           <w:p>
             <w:pPr>
-              <w:spacing w:after="40" w:before="60"/>
+              <w:spacing w:after="40" w:before="100"/>
             </w:pPr>
             <w:r>
               <w:rPr>
@@ -4270,7 +4260,7 @@
           </w:p>
           <w:p>
             <w:pPr>
-              <w:spacing w:after="60" w:before="0"/>
+              <w:spacing w:after="100" w:before="0"/>
             </w:pPr>
             <w:r>
               <w:rPr>
@@ -4287,7 +4277,7 @@
         </w:tc>
         <w:tc>
           <w:tcPr>
-            <w:tcW w:type="dxa" w:w="1200"/>
+            <w:tcW w:type="dxa" w:w="1268"/>
             <w:tcBorders>
               <w:top w:val="single" w:color="CBD5E0" w:sz="4"/>
               <w:left w:val="single" w:color="CBD5E0" w:sz="4"/>
@@ -4299,7 +4289,7 @@
           </w:tcPr>
           <w:p>
             <w:pPr>
-              <w:spacing w:after="60" w:before="60"/>
+              <w:spacing w:after="100" w:before="100"/>
               <w:jc w:val="center"/>
             </w:pPr>
             <w:r>
@@ -4308,27 +4298,27 @@
                 <w:b/>
                 <w:bCs/>
                 <w:color w:val="1E40AF"/>
-                <w:sz w:val="18"/>
-                <w:szCs w:val="18"/>
-              </w:rPr>
-              <w:t xml:space="preserve">Opportunity</w:t>
-            </w:r>
-          </w:p>
-        </w:tc>
-        <w:tc>
-          <w:tcPr>
-            <w:tcW w:type="dxa" w:w="3160"/>
-            <w:tcBorders>
-              <w:top w:val="single" w:color="CBD5E0" w:sz="4"/>
-              <w:left w:val="single" w:color="CBD5E0" w:sz="4"/>
-              <w:bottom w:val="single" w:color="CBD5E0" w:sz="4"/>
-              <w:right w:val="single" w:color="CBD5E0" w:sz="4"/>
-            </w:tcBorders>
-            <w:vAlign w:val="top"/>
-          </w:tcPr>
-          <w:p>
-            <w:pPr>
-              <w:spacing w:after="60" w:before="60"/>
+                <w:sz w:val="17"/>
+                <w:szCs w:val="17"/>
+              </w:rPr>
+              <w:t xml:space="preserve">Not Currently Captured</w:t>
+            </w:r>
+          </w:p>
+        </w:tc>
+        <w:tc>
+          <w:tcPr>
+            <w:tcW w:type="dxa" w:w="3200"/>
+            <w:tcBorders>
+              <w:top w:val="single" w:color="CBD5E0" w:sz="4"/>
+              <w:left w:val="single" w:color="CBD5E0" w:sz="4"/>
+              <w:bottom w:val="single" w:color="CBD5E0" w:sz="4"/>
+              <w:right w:val="single" w:color="CBD5E0" w:sz="4"/>
+            </w:tcBorders>
+            <w:vAlign w:val="top"/>
+          </w:tcPr>
+          <w:p>
+            <w:pPr>
+              <w:spacing w:after="100" w:before="100"/>
             </w:pPr>
             <w:r>
               <w:rPr>
@@ -4343,44 +4333,44 @@
         </w:tc>
         <w:tc>
           <w:tcPr>
-            <w:tcW w:type="dxa" w:w="3460"/>
-            <w:tcBorders>
-              <w:top w:val="single" w:color="CBD5E0" w:sz="4"/>
-              <w:left w:val="single" w:color="CBD5E0" w:sz="4"/>
-              <w:bottom w:val="single" w:color="CBD5E0" w:sz="4"/>
-              <w:right w:val="single" w:color="CBD5E0" w:sz="4"/>
-            </w:tcBorders>
-            <w:vAlign w:val="top"/>
-          </w:tcPr>
-          <w:p>
-            <w:pPr>
-              <w:spacing w:after="60" w:before="60"/>
-            </w:pPr>
-            <w:r>
-              <w:rPr>
-                <w:rFonts w:ascii="Calibri" w:cs="Calibri" w:eastAsia="Calibri" w:hAnsi="Calibri"/>
-                <w:color w:val="4A5568"/>
-                <w:sz w:val="18"/>
-                <w:szCs w:val="18"/>
-              </w:rPr>
-              <w:t xml:space="preserve">When applicable: which existing feature this replaces, the migration action required of customers, and the notification plan are not currently captured. A conditional note — present only when relevant — would address this without adding authoring effort to standard launches.</w:t>
-            </w:r>
-          </w:p>
-        </w:tc>
-        <w:tc>
-          <w:tcPr>
-            <w:tcW w:type="dxa" w:w="4160"/>
-            <w:tcBorders>
-              <w:top w:val="single" w:color="CBD5E0" w:sz="4"/>
-              <w:left w:val="single" w:color="CBD5E0" w:sz="4"/>
-              <w:bottom w:val="single" w:color="CBD5E0" w:sz="4"/>
-              <w:right w:val="single" w:color="CBD5E0" w:sz="4"/>
-            </w:tcBorders>
-            <w:vAlign w:val="top"/>
-          </w:tcPr>
-          <w:p>
-            <w:pPr>
-              <w:spacing w:after="60" w:before="60"/>
+            <w:tcW w:type="dxa" w:w="3600"/>
+            <w:tcBorders>
+              <w:top w:val="single" w:color="CBD5E0" w:sz="4"/>
+              <w:left w:val="single" w:color="CBD5E0" w:sz="4"/>
+              <w:bottom w:val="single" w:color="CBD5E0" w:sz="4"/>
+              <w:right w:val="single" w:color="CBD5E0" w:sz="4"/>
+            </w:tcBorders>
+            <w:vAlign w:val="top"/>
+          </w:tcPr>
+          <w:p>
+            <w:pPr>
+              <w:spacing w:after="100" w:before="100"/>
+            </w:pPr>
+            <w:r>
+              <w:rPr>
+                <w:rFonts w:ascii="Calibri" w:cs="Calibri" w:eastAsia="Calibri" w:hAnsi="Calibri"/>
+                <w:color w:val="4A5568"/>
+                <w:sz w:val="18"/>
+                <w:szCs w:val="18"/>
+              </w:rPr>
+              <w:t xml:space="preserve">When applicable, which existing feature this replaces, the migration action required of customers, and the notification plan are not currently captured by the skill and may already exist in a communications or migration plan.</w:t>
+            </w:r>
+          </w:p>
+        </w:tc>
+        <w:tc>
+          <w:tcPr>
+            <w:tcW w:type="dxa" w:w="4200"/>
+            <w:tcBorders>
+              <w:top w:val="single" w:color="CBD5E0" w:sz="4"/>
+              <w:left w:val="single" w:color="CBD5E0" w:sz="4"/>
+              <w:bottom w:val="single" w:color="CBD5E0" w:sz="4"/>
+              <w:right w:val="single" w:color="CBD5E0" w:sz="4"/>
+            </w:tcBorders>
+            <w:vAlign w:val="top"/>
+          </w:tcPr>
+          <w:p>
+            <w:pPr>
+              <w:spacing w:after="100" w:before="100"/>
             </w:pPr>
             <w:r>
               <w:rPr>
@@ -4408,7 +4398,7 @@
           </w:tcPr>
           <w:p>
             <w:pPr>
-              <w:spacing w:after="60" w:before="60"/>
+              <w:spacing w:after="100" w:before="100"/>
             </w:pPr>
             <w:r>
               <w:rPr>
@@ -4439,7 +4429,7 @@
           </w:tcPr>
           <w:p>
             <w:pPr>
-              <w:spacing w:after="40" w:before="60"/>
+              <w:spacing w:after="40" w:before="100"/>
             </w:pPr>
             <w:r>
               <w:rPr>
@@ -4455,7 +4445,7 @@
           </w:p>
           <w:p>
             <w:pPr>
-              <w:spacing w:after="60" w:before="0"/>
+              <w:spacing w:after="100" w:before="0"/>
             </w:pPr>
             <w:r>
               <w:rPr>
@@ -4472,7 +4462,7 @@
         </w:tc>
         <w:tc>
           <w:tcPr>
-            <w:tcW w:type="dxa" w:w="1200"/>
+            <w:tcW w:type="dxa" w:w="1268"/>
             <w:tcBorders>
               <w:top w:val="single" w:color="CBD5E0" w:sz="4"/>
               <w:left w:val="single" w:color="CBD5E0" w:sz="4"/>
@@ -4484,7 +4474,7 @@
           </w:tcPr>
           <w:p>
             <w:pPr>
-              <w:spacing w:after="60" w:before="60"/>
+              <w:spacing w:after="100" w:before="100"/>
               <w:jc w:val="center"/>
             </w:pPr>
             <w:r>
@@ -4493,8 +4483,8 @@
                 <w:b/>
                 <w:bCs/>
                 <w:color w:val="92400E"/>
-                <w:sz w:val="18"/>
-                <w:szCs w:val="18"/>
+                <w:sz w:val="17"/>
+                <w:szCs w:val="17"/>
               </w:rPr>
               <w:t xml:space="preserve">Partially Covered</w:t>
             </w:r>
@@ -4502,18 +4492,18 @@
         </w:tc>
         <w:tc>
           <w:tcPr>
-            <w:tcW w:type="dxa" w:w="3160"/>
-            <w:tcBorders>
-              <w:top w:val="single" w:color="CBD5E0" w:sz="4"/>
-              <w:left w:val="single" w:color="CBD5E0" w:sz="4"/>
-              <w:bottom w:val="single" w:color="CBD5E0" w:sz="4"/>
-              <w:right w:val="single" w:color="CBD5E0" w:sz="4"/>
-            </w:tcBorders>
-            <w:vAlign w:val="top"/>
-          </w:tcPr>
-          <w:p>
-            <w:pPr>
-              <w:spacing w:after="60" w:before="60"/>
+            <w:tcW w:type="dxa" w:w="3200"/>
+            <w:tcBorders>
+              <w:top w:val="single" w:color="CBD5E0" w:sz="4"/>
+              <w:left w:val="single" w:color="CBD5E0" w:sz="4"/>
+              <w:bottom w:val="single" w:color="CBD5E0" w:sz="4"/>
+              <w:right w:val="single" w:color="CBD5E0" w:sz="4"/>
+            </w:tcBorders>
+            <w:vAlign w:val="top"/>
+          </w:tcPr>
+          <w:p>
+            <w:pPr>
+              <w:spacing w:after="100" w:before="100"/>
             </w:pPr>
             <w:r>
               <w:rPr>
@@ -4528,44 +4518,44 @@
         </w:tc>
         <w:tc>
           <w:tcPr>
-            <w:tcW w:type="dxa" w:w="3460"/>
-            <w:tcBorders>
-              <w:top w:val="single" w:color="CBD5E0" w:sz="4"/>
-              <w:left w:val="single" w:color="CBD5E0" w:sz="4"/>
-              <w:bottom w:val="single" w:color="CBD5E0" w:sz="4"/>
-              <w:right w:val="single" w:color="CBD5E0" w:sz="4"/>
-            </w:tcBorders>
-            <w:vAlign w:val="top"/>
-          </w:tcPr>
-          <w:p>
-            <w:pPr>
-              <w:spacing w:after="60" w:before="60"/>
-            </w:pPr>
-            <w:r>
-              <w:rPr>
-                <w:rFonts w:ascii="Calibri" w:cs="Calibri" w:eastAsia="Calibri" w:hAnsi="Calibri"/>
-                <w:color w:val="4A5568"/>
-                <w:sz w:val="18"/>
-                <w:szCs w:val="18"/>
-              </w:rPr>
-              <w:t xml:space="preserve">A confidentiality tier for each roadmap item (approved for external use, internal only, embargoed until a date) and any named account commitments PMM should be aware of are not currently captured. A brief annotation would address this without restructuring the FAQ.</w:t>
-            </w:r>
-          </w:p>
-        </w:tc>
-        <w:tc>
-          <w:tcPr>
-            <w:tcW w:type="dxa" w:w="4160"/>
-            <w:tcBorders>
-              <w:top w:val="single" w:color="CBD5E0" w:sz="4"/>
-              <w:left w:val="single" w:color="CBD5E0" w:sz="4"/>
-              <w:bottom w:val="single" w:color="CBD5E0" w:sz="4"/>
-              <w:right w:val="single" w:color="CBD5E0" w:sz="4"/>
-            </w:tcBorders>
-            <w:vAlign w:val="top"/>
-          </w:tcPr>
-          <w:p>
-            <w:pPr>
-              <w:spacing w:after="60" w:before="60"/>
+            <w:tcW w:type="dxa" w:w="3600"/>
+            <w:tcBorders>
+              <w:top w:val="single" w:color="CBD5E0" w:sz="4"/>
+              <w:left w:val="single" w:color="CBD5E0" w:sz="4"/>
+              <w:bottom w:val="single" w:color="CBD5E0" w:sz="4"/>
+              <w:right w:val="single" w:color="CBD5E0" w:sz="4"/>
+            </w:tcBorders>
+            <w:vAlign w:val="top"/>
+          </w:tcPr>
+          <w:p>
+            <w:pPr>
+              <w:spacing w:after="100" w:before="100"/>
+            </w:pPr>
+            <w:r>
+              <w:rPr>
+                <w:rFonts w:ascii="Calibri" w:cs="Calibri" w:eastAsia="Calibri" w:hAnsi="Calibri"/>
+                <w:color w:val="4A5568"/>
+                <w:sz w:val="18"/>
+                <w:szCs w:val="18"/>
+              </w:rPr>
+              <w:t xml:space="preserve">A confidentiality classification for each roadmap item (approved for external use, internal only, or embargoed until a specific date) and any named account commitments PMM should be aware of are not currently captured by the skill and may already exist in an approved roadmap or customer commitment tracker.</w:t>
+            </w:r>
+          </w:p>
+        </w:tc>
+        <w:tc>
+          <w:tcPr>
+            <w:tcW w:type="dxa" w:w="4200"/>
+            <w:tcBorders>
+              <w:top w:val="single" w:color="CBD5E0" w:sz="4"/>
+              <w:left w:val="single" w:color="CBD5E0" w:sz="4"/>
+              <w:bottom w:val="single" w:color="CBD5E0" w:sz="4"/>
+              <w:right w:val="single" w:color="CBD5E0" w:sz="4"/>
+            </w:tcBorders>
+            <w:vAlign w:val="top"/>
+          </w:tcPr>
+          <w:p>
+            <w:pPr>
+              <w:spacing w:after="100" w:before="100"/>
             </w:pPr>
             <w:r>
               <w:rPr>
@@ -4615,7 +4605,7 @@
           <w:sz w:val="20"/>
           <w:szCs w:val="20"/>
         </w:rPr>
-        <w:t xml:space="preserve">The following recommendations are grouped by likely impact on PMM's ability to begin GTM planning. They are presented as improvements to information availability — not as mandatory additions to the Release Notes template. The appropriate place for each piece of information should be determined based on team workflows.</w:t>
+        <w:t xml:space="preserve">The following recommendations are grouped by likely impact on PMM's ability to begin GTM planning. They are framed as improvements to information availability — not as mandatory additions to the Release Notes template. The appropriate place for each piece of information should be determined based on team workflows.</w:t>
       </w:r>
     </w:p>
     <w:p>
@@ -4678,7 +4668,7 @@
     </w:p>
     <w:p>
       <w:pPr>
-        <w:spacing w:after="100"/>
+        <w:spacing w:after="120"/>
         <w:ind w:left="720"/>
       </w:pPr>
       <w:r>
@@ -4721,7 +4711,7 @@
     </w:p>
     <w:p>
       <w:pPr>
-        <w:spacing w:after="100"/>
+        <w:spacing w:after="120"/>
         <w:ind w:left="720"/>
       </w:pPr>
       <w:r>
@@ -4759,12 +4749,12 @@
           <w:sz w:val="20"/>
           <w:szCs w:val="20"/>
         </w:rPr>
-        <w:t xml:space="preserve">Capture dependencies and deployment model</w:t>
-      </w:r>
-    </w:p>
-    <w:p>
-      <w:pPr>
-        <w:spacing w:after="100"/>
+        <w:t xml:space="preserve">Ensure dependencies and deployment model are accessible</w:t>
+      </w:r>
+    </w:p>
+    <w:p>
+      <w:pPr>
+        <w:spacing w:after="120"/>
         <w:ind w:left="720"/>
       </w:pPr>
       <w:r>
@@ -4802,12 +4792,12 @@
           <w:sz w:val="20"/>
           <w:szCs w:val="20"/>
         </w:rPr>
-        <w:t xml:space="preserve">Clarify roadmap confidentiality tiers</w:t>
-      </w:r>
-    </w:p>
-    <w:p>
-      <w:pPr>
-        <w:spacing w:after="100"/>
+        <w:t xml:space="preserve">Ensure Kano model classification is accessible to PMM</w:t>
+      </w:r>
+    </w:p>
+    <w:p>
+      <w:pPr>
+        <w:spacing w:after="80"/>
         <w:ind w:left="720"/>
       </w:pPr>
       <w:r>
@@ -4817,7 +4807,22 @@
           <w:sz w:val="20"/>
           <w:szCs w:val="20"/>
         </w:rPr>
-        <w:t xml:space="preserve">For each roadmap item referenced in the handoff, a simple classification (approved for external use, internal only, or embargoed until a specific date) would give PMM and Sales clear guidance without requiring a follow-up conversation. This is a small addition with meaningful downstream impact.</w:t>
+        <w:t xml:space="preserve">The Kano classification — whether a feature is a Must-have, Performance driver, or Delighter — directly determines launch priority, messaging emphasis, campaign investment, analyst positioning, and executive communications. A Must-have framing calls for a different level of urgency and communication reach than a Delighter; without this signal, PMM may over- or under-invest in launch preparation relative to the feature's strategic weight.</w:t>
+      </w:r>
+    </w:p>
+    <w:p>
+      <w:pPr>
+        <w:spacing w:after="120"/>
+        <w:ind w:left="720"/>
+      </w:pPr>
+      <w:r>
+        <w:rPr>
+          <w:rFonts w:ascii="Calibri" w:cs="Calibri" w:eastAsia="Calibri" w:hAnsi="Calibri"/>
+          <w:color w:val="4A5568"/>
+          <w:sz w:val="20"/>
+          <w:szCs w:val="20"/>
+        </w:rPr>
+        <w:t xml:space="preserve">The Kano classification does not need to live inside the Release Notes Skill. The objective is simply to ensure this information exists somewhere in the Product workflow and is accessible to PMM before GTM work begins — whether that is a PRD, a Shift Left brief, or another Product artifact.</w:t>
       </w:r>
     </w:p>
     <w:p>
@@ -4862,12 +4867,12 @@
           <w:sz w:val="20"/>
           <w:szCs w:val="20"/>
         </w:rPr>
-        <w:t xml:space="preserve">Expand ICP inputs with fit signals and anti-patterns</w:t>
-      </w:r>
-    </w:p>
-    <w:p>
-      <w:pPr>
-        <w:spacing w:after="100"/>
+        <w:t xml:space="preserve">Clarify roadmap confidentiality tiers</w:t>
+      </w:r>
+    </w:p>
+    <w:p>
+      <w:pPr>
+        <w:spacing w:after="120"/>
         <w:ind w:left="720"/>
       </w:pPr>
       <w:r>
@@ -4877,7 +4882,7 @@
           <w:sz w:val="20"/>
           <w:szCs w:val="20"/>
         </w:rPr>
-        <w:t xml:space="preserve">Alongside customer type, three to five strong-fit signals and three to five anti-patterns populate ABM lists and sales qualification criteria. These are often known by Product at the time of writing and can be captured in the skill or referenced from an existing ICP document.</w:t>
+        <w:t xml:space="preserve">For each roadmap item referenced in a handoff, a simple classification — approved for external use, internal only, or embargoed until a specific date — would give PMM and Sales clear guidance without requiring a follow-up conversation. This becomes important whenever roadmap information is being shared with customers or analysts.</w:t>
       </w:r>
     </w:p>
     <w:p>
@@ -4905,12 +4910,12 @@
           <w:sz w:val="20"/>
           <w:szCs w:val="20"/>
         </w:rPr>
-        <w:t xml:space="preserve">Include a reference to 30/60/90-day success metrics</w:t>
-      </w:r>
-    </w:p>
-    <w:p>
-      <w:pPr>
-        <w:spacing w:after="100"/>
+        <w:t xml:space="preserve">Expand ICP inputs with fit signals and anti-patterns</w:t>
+      </w:r>
+    </w:p>
+    <w:p>
+      <w:pPr>
+        <w:spacing w:after="120"/>
         <w:ind w:left="720"/>
       </w:pPr>
       <w:r>
@@ -4920,7 +4925,7 @@
           <w:sz w:val="20"/>
           <w:szCs w:val="20"/>
         </w:rPr>
-        <w:t xml:space="preserve">The metrics Product intends to track post-launch, with a pointer to the relevant dashboard or report, allow PMM to align launch reporting from day one. This can be a link to an existing tracker rather than new content.</w:t>
+        <w:t xml:space="preserve">Alongside customer type, three to five strong-fit signals and three to five anti-patterns populate ABM lists and sales qualification criteria. These are often known by Product at the time of writing and may already exist in an ICP document that can be referenced.</w:t>
       </w:r>
     </w:p>
     <w:p>
@@ -4948,12 +4953,12 @@
           <w:sz w:val="20"/>
           <w:szCs w:val="20"/>
         </w:rPr>
-        <w:t xml:space="preserve">Note Kano model classification alongside business objective</w:t>
-      </w:r>
-    </w:p>
-    <w:p>
-      <w:pPr>
-        <w:spacing w:after="100"/>
+        <w:t xml:space="preserve">Ensure 30/60/90-day success metrics are accessible to PMM</w:t>
+      </w:r>
+    </w:p>
+    <w:p>
+      <w:pPr>
+        <w:spacing w:after="120"/>
         <w:ind w:left="720"/>
       </w:pPr>
       <w:r>
@@ -4963,7 +4968,7 @@
           <w:sz w:val="20"/>
           <w:szCs w:val="20"/>
         </w:rPr>
-        <w:t xml:space="preserve">A one-line Kano classification (Must-have, Performance, Delighter) with a brief rationale gives PMM immediate insight into how prominently to position the feature in launch communications. This may be sourced from an existing PRD or Shift Left document.</w:t>
+        <w:t xml:space="preserve">The metrics Product intends to track post-launch, with a pointer to the relevant dashboard or report, allow PMM to align launch reporting from day one. This can be a link to an existing tracker rather than new content.</w:t>
       </w:r>
     </w:p>
     <w:p>
@@ -4996,7 +5001,7 @@
     </w:p>
     <w:p>
       <w:pPr>
-        <w:spacing w:after="100"/>
+        <w:spacing w:after="120"/>
         <w:ind w:left="720"/>
       </w:pPr>
       <w:r>
@@ -5051,12 +5056,12 @@
           <w:sz w:val="20"/>
           <w:szCs w:val="20"/>
         </w:rPr>
-        <w:t xml:space="preserve">Add a pointer to end-to-end workflow documentation</w:t>
-      </w:r>
-    </w:p>
-    <w:p>
-      <w:pPr>
-        <w:spacing w:after="100"/>
+        <w:t xml:space="preserve">Reference end-to-end workflow documentation</w:t>
+      </w:r>
+    </w:p>
+    <w:p>
+      <w:pPr>
+        <w:spacing w:after="120"/>
         <w:ind w:left="720"/>
       </w:pPr>
       <w:r>
@@ -5099,7 +5104,7 @@
     </w:p>
     <w:p>
       <w:pPr>
-        <w:spacing w:after="100"/>
+        <w:spacing w:after="120"/>
         <w:ind w:left="720"/>
       </w:pPr>
       <w:r>
@@ -5142,7 +5147,7 @@
     </w:p>
     <w:p>
       <w:pPr>
-        <w:spacing w:after="100"/>
+        <w:spacing w:after="120"/>
         <w:ind w:left="720"/>
       </w:pPr>
       <w:r>
@@ -5180,12 +5185,12 @@
           <w:sz w:val="20"/>
           <w:szCs w:val="20"/>
         </w:rPr>
-        <w:t xml:space="preserve">Add conditional migration or deprecation note when applicable</w:t>
-      </w:r>
-    </w:p>
-    <w:p>
-      <w:pPr>
-        <w:spacing w:after="100"/>
+        <w:t xml:space="preserve">Note migration or deprecation context when applicable</w:t>
+      </w:r>
+    </w:p>
+    <w:p>
+      <w:pPr>
+        <w:spacing w:after="120"/>
         <w:ind w:left="720"/>
       </w:pPr>
       <w:r>
@@ -5195,12 +5200,12 @@
           <w:sz w:val="20"/>
           <w:szCs w:val="20"/>
         </w:rPr>
-        <w:t xml:space="preserve">When a feature replaces an existing workflow, a brief note on the migration action and notification plan helps PMM prepare transition communications in advance. This section would only apply when relevant, adding no burden to standard launches.</w:t>
-      </w:r>
-    </w:p>
-    <w:p>
-      <w:pPr>
-        <w:spacing w:before="360"/>
+        <w:t xml:space="preserve">When a feature replaces an existing workflow, a brief note on the migration action and notification plan helps PMM prepare transition communications in advance. This would only apply when relevant, adding no burden to standard launches.</w:t>
+      </w:r>
+    </w:p>
+    <w:p>
+      <w:pPr>
+        <w:spacing w:before="400"/>
       </w:pPr>
     </w:p>
     <w:p>
@@ -5229,7 +5234,7 @@
           <w:sz w:val="20"/>
           <w:szCs w:val="20"/>
         </w:rPr>
-        <w:t xml:space="preserve">Many of the information requirements identified in this review do not require Product to write new content. In a large number of cases, a reference or link to an existing document — a PRD, a Shift Left brief, a Confluence page, a Loom recording, or a dashboard link — would be sufficient. The intention is to improve downstream collaboration and reduce the pre-launch back-and-forth between Product and Marketing, not to increase the authoring burden on Product teams.</w:t>
+        <w:t xml:space="preserve">Many of the information requirements identified in this review do not require Product to write new content. In a large number of cases, a reference or link to an existing document — a PRD, a Shift Left brief, a Confluence page, a Loom recording, or a dashboard link — would be sufficient. The intention is to improve downstream collaboration and reduce pre-launch back-and-forth between Product and Marketing, not to increase the authoring burden on Product teams.</w:t>
       </w:r>
     </w:p>
     <w:p>

</xml_diff>